<commit_message>
chore: ignore runtime artifacts and venv
</commit_message>
<xml_diff>
--- a/docs/CareerOS Build Roadmap From Scratch.docx
+++ b/docs/CareerOS Build Roadmap From Scratch.docx
@@ -16,7 +16,6 @@
           <w14:ligatures w14:val="none"/>
         </w:rPr>
       </w:pPr>
-      <w:proofErr w:type="spellStart"/>
       <w:r>
         <w:rPr>
           <w:rFonts w:ascii="Times New Roman" w:eastAsia="Times New Roman" w:hAnsi="Times New Roman" w:cs="Times New Roman"/>
@@ -27,46 +26,7 @@
           <w:szCs w:val="48"/>
           <w14:ligatures w14:val="none"/>
         </w:rPr>
-        <w:t>CareerOS</w:t>
-      </w:r>
-      <w:proofErr w:type="spellEnd"/>
-      <w:r>
-        <w:rPr>
-          <w:rFonts w:ascii="Times New Roman" w:eastAsia="Times New Roman" w:hAnsi="Times New Roman" w:cs="Times New Roman"/>
-          <w:b/>
-          <w:bCs/>
-          <w:kern w:val="36"/>
-          <w:sz w:val="48"/>
-          <w:szCs w:val="48"/>
-          <w14:ligatures w14:val="none"/>
-        </w:rPr>
-        <w:t xml:space="preserve"> Build Roadmap </w:t>
-      </w:r>
-      <w:proofErr w:type="gramStart"/>
-      <w:r>
-        <w:rPr>
-          <w:rFonts w:ascii="Times New Roman" w:eastAsia="Times New Roman" w:hAnsi="Times New Roman" w:cs="Times New Roman"/>
-          <w:b/>
-          <w:bCs/>
-          <w:kern w:val="36"/>
-          <w:sz w:val="48"/>
-          <w:szCs w:val="48"/>
-          <w14:ligatures w14:val="none"/>
-        </w:rPr>
-        <w:t>From</w:t>
-      </w:r>
-      <w:proofErr w:type="gramEnd"/>
-      <w:r>
-        <w:rPr>
-          <w:rFonts w:ascii="Times New Roman" w:eastAsia="Times New Roman" w:hAnsi="Times New Roman" w:cs="Times New Roman"/>
-          <w:b/>
-          <w:bCs/>
-          <w:kern w:val="36"/>
-          <w:sz w:val="48"/>
-          <w:szCs w:val="48"/>
-          <w14:ligatures w14:val="none"/>
-        </w:rPr>
-        <w:t xml:space="preserve"> Scratch (End-to-End)</w:t>
+        <w:t>CareerOS Build Roadmap From Scratch (End-to-End)</w:t>
       </w:r>
     </w:p>
     <w:p>
@@ -542,43 +502,7 @@
           <w:kern w:val="0"/>
           <w14:ligatures w14:val="none"/>
         </w:rPr>
-        <w:t xml:space="preserve">Optional: </w:t>
-      </w:r>
-      <w:proofErr w:type="spellStart"/>
-      <w:r>
-        <w:rPr>
-          <w:rFonts w:ascii="Times New Roman" w:eastAsia="Times New Roman" w:hAnsi="Times New Roman" w:cs="Times New Roman"/>
-          <w:kern w:val="0"/>
-          <w14:ligatures w14:val="none"/>
-        </w:rPr>
-        <w:t>Groq</w:t>
-      </w:r>
-      <w:proofErr w:type="spellEnd"/>
-      <w:r>
-        <w:rPr>
-          <w:rFonts w:ascii="Times New Roman" w:eastAsia="Times New Roman" w:hAnsi="Times New Roman" w:cs="Times New Roman"/>
-          <w:kern w:val="0"/>
-          <w14:ligatures w14:val="none"/>
-        </w:rPr>
-        <w:t xml:space="preserve"> / Together / </w:t>
-      </w:r>
-      <w:proofErr w:type="spellStart"/>
-      <w:r>
-        <w:rPr>
-          <w:rFonts w:ascii="Times New Roman" w:eastAsia="Times New Roman" w:hAnsi="Times New Roman" w:cs="Times New Roman"/>
-          <w:kern w:val="0"/>
-          <w14:ligatures w14:val="none"/>
-        </w:rPr>
-        <w:t>OpenRouter</w:t>
-      </w:r>
-      <w:proofErr w:type="spellEnd"/>
-      <w:r>
-        <w:rPr>
-          <w:rFonts w:ascii="Times New Roman" w:eastAsia="Times New Roman" w:hAnsi="Times New Roman" w:cs="Times New Roman"/>
-          <w:kern w:val="0"/>
-          <w14:ligatures w14:val="none"/>
-        </w:rPr>
-        <w:t xml:space="preserve"> free tiers (if you want hosted inference later)</w:t>
+        <w:t>Optional: Groq / Together / OpenRouter free tiers (if you want hosted inference later)</w:t>
       </w:r>
     </w:p>
     <w:p>
@@ -595,18 +519,9 @@
           <w:rFonts w:ascii="Times New Roman" w:eastAsia="Times New Roman" w:hAnsi="Times New Roman" w:cs="Times New Roman"/>
           <w:noProof/>
           <w:kern w:val="0"/>
-          <w14:ligatures w14:val="none"/>
-        </w:rPr>
-      </w:r>
-      <w:r>
-        <w:rPr>
-          <w:rFonts w:ascii="Times New Roman" w:eastAsia="Times New Roman" w:hAnsi="Times New Roman" w:cs="Times New Roman"/>
-          <w:noProof/>
-          <w:kern w:val="0"/>
-          <w14:ligatures w14:val="none"/>
-        </w:rPr>
-        <w:pict w14:anchorId="3069E0E5">
-          <v:rect id="_x0000_i1025" alt="" style="width:468pt;height:.05pt;mso-width-percent:0;mso-height-percent:0;mso-width-percent:0;mso-height-percent:0" o:hralign="center" o:hrstd="t" o:hr="t" fillcolor="#a0a0a0" stroked="f"/>
+        </w:rPr>
+        <w:pict w14:anchorId="61943B52">
+          <v:rect id="_x0000_i1045" alt="" style="width:468pt;height:.05pt;mso-width-percent:0;mso-height-percent:0;mso-width-percent:0;mso-height-percent:0" o:hralign="center" o:hrstd="t" o:hr="t" fillcolor="#a0a0a0" stroked="f"/>
         </w:pict>
       </w:r>
     </w:p>
@@ -681,7 +596,6 @@
         </w:rPr>
         <w:t xml:space="preserve">Repo name: </w:t>
       </w:r>
-      <w:proofErr w:type="spellStart"/>
       <w:r>
         <w:rPr>
           <w:rFonts w:ascii="Courier New" w:eastAsia="Times New Roman" w:hAnsi="Courier New" w:cs="Courier New"/>
@@ -692,7 +606,6 @@
         </w:rPr>
         <w:t>careeros</w:t>
       </w:r>
-      <w:proofErr w:type="spellEnd"/>
       <w:r>
         <w:rPr>
           <w:rFonts w:ascii="Times New Roman" w:eastAsia="Times New Roman" w:hAnsi="Times New Roman" w:cs="Times New Roman"/>
@@ -716,35 +629,7 @@
           <w:kern w:val="0"/>
           <w14:ligatures w14:val="none"/>
         </w:rPr>
-        <w:t>, license optional</w:t>
-      </w:r>
-      <w:proofErr w:type="gramStart"/>
-      <w:r>
-        <w:rPr>
-          <w:rFonts w:ascii="Times New Roman" w:eastAsia="Times New Roman" w:hAnsi="Times New Roman" w:cs="Times New Roman"/>
-          <w:kern w:val="0"/>
-          <w14:ligatures w14:val="none"/>
-        </w:rPr>
-        <w:t>, .</w:t>
-      </w:r>
-      <w:proofErr w:type="spellStart"/>
-      <w:r>
-        <w:rPr>
-          <w:rFonts w:ascii="Times New Roman" w:eastAsia="Times New Roman" w:hAnsi="Times New Roman" w:cs="Times New Roman"/>
-          <w:kern w:val="0"/>
-          <w14:ligatures w14:val="none"/>
-        </w:rPr>
-        <w:t>gitignore</w:t>
-      </w:r>
-      <w:proofErr w:type="spellEnd"/>
-      <w:proofErr w:type="gramEnd"/>
-      <w:r>
-        <w:rPr>
-          <w:rFonts w:ascii="Times New Roman" w:eastAsia="Times New Roman" w:hAnsi="Times New Roman" w:cs="Times New Roman"/>
-          <w:kern w:val="0"/>
-          <w14:ligatures w14:val="none"/>
-        </w:rPr>
-        <w:t xml:space="preserve"> later.</w:t>
+        <w:t>, license optional, .gitignore later.</w:t>
       </w:r>
     </w:p>
     <w:p>
@@ -852,20 +737,8 @@
           <w14:ligatures w14:val="none"/>
         </w:rPr>
         <w:lastRenderedPageBreak/>
-        <w:t xml:space="preserve">cd </w:t>
-      </w:r>
-      <w:proofErr w:type="spellStart"/>
-      <w:r>
-        <w:rPr>
-          <w:rFonts w:ascii="Courier New" w:eastAsia="Times New Roman" w:hAnsi="Courier New" w:cs="Courier New"/>
-          <w:kern w:val="0"/>
-          <w:sz w:val="20"/>
-          <w:szCs w:val="20"/>
-          <w14:ligatures w14:val="none"/>
-        </w:rPr>
-        <w:t>careeros</w:t>
-      </w:r>
-      <w:proofErr w:type="spellEnd"/>
+        <w:t>cd careeros</w:t>
+      </w:r>
     </w:p>
     <w:p>
       <w:pPr>
@@ -896,7 +769,6 @@
           <w14:ligatures w14:val="none"/>
         </w:rPr>
       </w:pPr>
-      <w:proofErr w:type="gramStart"/>
       <w:r>
         <w:rPr>
           <w:rFonts w:ascii="Courier New" w:eastAsia="Times New Roman" w:hAnsi="Courier New" w:cs="Courier New"/>
@@ -907,7 +779,6 @@
         </w:rPr>
         <w:t>code .</w:t>
       </w:r>
-      <w:proofErr w:type="gramEnd"/>
     </w:p>
     <w:p>
       <w:pPr>
@@ -967,30 +838,16 @@
           <w14:ligatures w14:val="none"/>
         </w:rPr>
       </w:pPr>
-      <w:proofErr w:type="gramStart"/>
-      <w:r>
-        <w:rPr>
-          <w:rFonts w:ascii="Courier New" w:eastAsia="Times New Roman" w:hAnsi="Courier New" w:cs="Courier New"/>
-          <w:kern w:val="0"/>
-          <w:sz w:val="20"/>
-          <w:szCs w:val="20"/>
-          <w14:ligatures w14:val="none"/>
-        </w:rPr>
-        <w:t>.</w:t>
-      </w:r>
-      <w:proofErr w:type="spellStart"/>
-      <w:r>
-        <w:rPr>
-          <w:rFonts w:ascii="Courier New" w:eastAsia="Times New Roman" w:hAnsi="Courier New" w:cs="Courier New"/>
-          <w:kern w:val="0"/>
-          <w:sz w:val="20"/>
-          <w:szCs w:val="20"/>
-          <w14:ligatures w14:val="none"/>
-        </w:rPr>
-        <w:t>gitignore</w:t>
-      </w:r>
-      <w:proofErr w:type="spellEnd"/>
-      <w:proofErr w:type="gramEnd"/>
+      <w:r>
+        <w:rPr>
+          <w:rFonts w:ascii="Courier New" w:eastAsia="Times New Roman" w:hAnsi="Courier New" w:cs="Courier New"/>
+          <w:kern w:val="0"/>
+          <w:sz w:val="20"/>
+          <w:szCs w:val="20"/>
+          <w14:ligatures w14:val="none"/>
+        </w:rPr>
+        <w:t>.gitignore</w:t>
+      </w:r>
     </w:p>
     <w:p>
       <w:pPr>
@@ -1005,40 +862,16 @@
           <w14:ligatures w14:val="none"/>
         </w:rPr>
       </w:pPr>
-      <w:proofErr w:type="gramStart"/>
-      <w:r>
-        <w:rPr>
-          <w:rFonts w:ascii="Courier New" w:eastAsia="Times New Roman" w:hAnsi="Courier New" w:cs="Courier New"/>
-          <w:kern w:val="0"/>
-          <w:sz w:val="20"/>
-          <w:szCs w:val="20"/>
-          <w14:ligatures w14:val="none"/>
-        </w:rPr>
-        <w:t>.</w:t>
-      </w:r>
-      <w:proofErr w:type="spellStart"/>
-      <w:r>
-        <w:rPr>
-          <w:rFonts w:ascii="Courier New" w:eastAsia="Times New Roman" w:hAnsi="Courier New" w:cs="Courier New"/>
-          <w:kern w:val="0"/>
-          <w:sz w:val="20"/>
-          <w:szCs w:val="20"/>
-          <w14:ligatures w14:val="none"/>
-        </w:rPr>
-        <w:t>env</w:t>
-      </w:r>
-      <w:proofErr w:type="gramEnd"/>
-      <w:r>
-        <w:rPr>
-          <w:rFonts w:ascii="Courier New" w:eastAsia="Times New Roman" w:hAnsi="Courier New" w:cs="Courier New"/>
-          <w:kern w:val="0"/>
-          <w:sz w:val="20"/>
-          <w:szCs w:val="20"/>
-          <w14:ligatures w14:val="none"/>
-        </w:rPr>
-        <w:t>.example</w:t>
-      </w:r>
-      <w:proofErr w:type="spellEnd"/>
+      <w:r>
+        <w:rPr>
+          <w:rFonts w:ascii="Courier New" w:eastAsia="Times New Roman" w:hAnsi="Courier New" w:cs="Courier New"/>
+          <w:kern w:val="0"/>
+          <w:sz w:val="20"/>
+          <w:szCs w:val="20"/>
+          <w14:ligatures w14:val="none"/>
+        </w:rPr>
+        <w:t>.env.example</w:t>
+      </w:r>
     </w:p>
     <w:p>
       <w:pPr>
@@ -1198,7 +1031,6 @@
           <w14:ligatures w14:val="none"/>
         </w:rPr>
       </w:pPr>
-      <w:proofErr w:type="gramStart"/>
       <w:r>
         <w:rPr>
           <w:rFonts w:ascii="Times New Roman" w:eastAsia="Times New Roman" w:hAnsi="Times New Roman" w:cs="Times New Roman"/>
@@ -1221,23 +1053,8 @@
           <w:szCs w:val="20"/>
           <w14:ligatures w14:val="none"/>
         </w:rPr>
-        <w:t>.</w:t>
-      </w:r>
-      <w:proofErr w:type="spellStart"/>
-      <w:r>
-        <w:rPr>
-          <w:rFonts w:ascii="Courier New" w:eastAsia="Times New Roman" w:hAnsi="Courier New" w:cs="Courier New"/>
-          <w:b/>
-          <w:bCs/>
-          <w:kern w:val="0"/>
-          <w:sz w:val="20"/>
-          <w:szCs w:val="20"/>
-          <w14:ligatures w14:val="none"/>
-        </w:rPr>
-        <w:t>gitignore</w:t>
-      </w:r>
-      <w:proofErr w:type="spellEnd"/>
-      <w:proofErr w:type="gramEnd"/>
+        <w:t>.gitignore</w:t>
+      </w:r>
       <w:r>
         <w:rPr>
           <w:rFonts w:ascii="Times New Roman" w:eastAsia="Times New Roman" w:hAnsi="Times New Roman" w:cs="Times New Roman"/>
@@ -1280,39 +1097,15 @@
           <w14:ligatures w14:val="none"/>
         </w:rPr>
       </w:pPr>
-      <w:proofErr w:type="gramStart"/>
-      <w:r>
-        <w:rPr>
-          <w:rFonts w:ascii="Courier New" w:eastAsia="Times New Roman" w:hAnsi="Courier New" w:cs="Courier New"/>
-          <w:kern w:val="0"/>
-          <w:sz w:val="20"/>
-          <w:szCs w:val="20"/>
-          <w14:ligatures w14:val="none"/>
-        </w:rPr>
-        <w:t>.</w:t>
-      </w:r>
-      <w:proofErr w:type="spellStart"/>
-      <w:r>
-        <w:rPr>
-          <w:rFonts w:ascii="Courier New" w:eastAsia="Times New Roman" w:hAnsi="Courier New" w:cs="Courier New"/>
-          <w:kern w:val="0"/>
-          <w:sz w:val="20"/>
-          <w:szCs w:val="20"/>
-          <w14:ligatures w14:val="none"/>
-        </w:rPr>
-        <w:t>venv</w:t>
-      </w:r>
-      <w:proofErr w:type="spellEnd"/>
-      <w:proofErr w:type="gramEnd"/>
-      <w:r>
-        <w:rPr>
-          <w:rFonts w:ascii="Courier New" w:eastAsia="Times New Roman" w:hAnsi="Courier New" w:cs="Courier New"/>
-          <w:kern w:val="0"/>
-          <w:sz w:val="20"/>
-          <w:szCs w:val="20"/>
-          <w14:ligatures w14:val="none"/>
-        </w:rPr>
-        <w:t>/</w:t>
+      <w:r>
+        <w:rPr>
+          <w:rFonts w:ascii="Courier New" w:eastAsia="Times New Roman" w:hAnsi="Courier New" w:cs="Courier New"/>
+          <w:kern w:val="0"/>
+          <w:sz w:val="20"/>
+          <w:szCs w:val="20"/>
+          <w14:ligatures w14:val="none"/>
+        </w:rPr>
+        <w:t>.venv/</w:t>
       </w:r>
     </w:p>
     <w:p>
@@ -1352,29 +1145,7 @@
           <w:szCs w:val="20"/>
           <w14:ligatures w14:val="none"/>
         </w:rPr>
-        <w:t>__</w:t>
-      </w:r>
-      <w:proofErr w:type="spellStart"/>
-      <w:r>
-        <w:rPr>
-          <w:rFonts w:ascii="Courier New" w:eastAsia="Times New Roman" w:hAnsi="Courier New" w:cs="Courier New"/>
-          <w:kern w:val="0"/>
-          <w:sz w:val="20"/>
-          <w:szCs w:val="20"/>
-          <w14:ligatures w14:val="none"/>
-        </w:rPr>
-        <w:t>pycache</w:t>
-      </w:r>
-      <w:proofErr w:type="spellEnd"/>
-      <w:r>
-        <w:rPr>
-          <w:rFonts w:ascii="Courier New" w:eastAsia="Times New Roman" w:hAnsi="Courier New" w:cs="Courier New"/>
-          <w:kern w:val="0"/>
-          <w:sz w:val="20"/>
-          <w:szCs w:val="20"/>
-          <w14:ligatures w14:val="none"/>
-        </w:rPr>
-        <w:t>__/</w:t>
+        <w:t>__pycache__/</w:t>
       </w:r>
     </w:p>
     <w:p>
@@ -1414,20 +1185,8 @@
           <w:szCs w:val="20"/>
           <w14:ligatures w14:val="none"/>
         </w:rPr>
-        <w:t>*.</w:t>
-      </w:r>
-      <w:proofErr w:type="spellStart"/>
-      <w:r>
-        <w:rPr>
-          <w:rFonts w:ascii="Courier New" w:eastAsia="Times New Roman" w:hAnsi="Courier New" w:cs="Courier New"/>
-          <w:kern w:val="0"/>
-          <w:sz w:val="20"/>
-          <w:szCs w:val="20"/>
-          <w14:ligatures w14:val="none"/>
-        </w:rPr>
-        <w:t>pyc</w:t>
-      </w:r>
-      <w:proofErr w:type="spellEnd"/>
+        <w:t>*.pyc</w:t>
+      </w:r>
     </w:p>
     <w:p>
       <w:pPr>
@@ -1458,7 +1217,6 @@
           <w14:ligatures w14:val="none"/>
         </w:rPr>
       </w:pPr>
-      <w:proofErr w:type="gramStart"/>
       <w:r>
         <w:rPr>
           <w:rFonts w:ascii="Courier New" w:eastAsia="Times New Roman" w:hAnsi="Courier New" w:cs="Courier New"/>
@@ -1469,7 +1227,6 @@
         </w:rPr>
         <w:t>.env</w:t>
       </w:r>
-      <w:proofErr w:type="gramEnd"/>
     </w:p>
     <w:p>
       <w:pPr>
@@ -1508,20 +1265,8 @@
           <w:szCs w:val="20"/>
           <w14:ligatures w14:val="none"/>
         </w:rPr>
-        <w:t>.</w:t>
-      </w:r>
-      <w:proofErr w:type="spellStart"/>
-      <w:r>
-        <w:rPr>
-          <w:rFonts w:ascii="Courier New" w:eastAsia="Times New Roman" w:hAnsi="Courier New" w:cs="Courier New"/>
-          <w:kern w:val="0"/>
-          <w:sz w:val="20"/>
-          <w:szCs w:val="20"/>
-          <w14:ligatures w14:val="none"/>
-        </w:rPr>
-        <w:t>DS_Store</w:t>
-      </w:r>
-      <w:proofErr w:type="spellEnd"/>
+        <w:t>.DS_Store</w:t>
+      </w:r>
     </w:p>
     <w:p>
       <w:pPr>
@@ -1552,49 +1297,15 @@
           <w14:ligatures w14:val="none"/>
         </w:rPr>
       </w:pPr>
-      <w:proofErr w:type="gramStart"/>
-      <w:r>
-        <w:rPr>
-          <w:rFonts w:ascii="Courier New" w:eastAsia="Times New Roman" w:hAnsi="Courier New" w:cs="Courier New"/>
-          <w:kern w:val="0"/>
-          <w:sz w:val="20"/>
-          <w:szCs w:val="20"/>
-          <w14:ligatures w14:val="none"/>
-        </w:rPr>
-        <w:t>.</w:t>
-      </w:r>
-      <w:proofErr w:type="spellStart"/>
-      <w:r>
-        <w:rPr>
-          <w:rFonts w:ascii="Courier New" w:eastAsia="Times New Roman" w:hAnsi="Courier New" w:cs="Courier New"/>
-          <w:kern w:val="0"/>
-          <w:sz w:val="20"/>
-          <w:szCs w:val="20"/>
-          <w14:ligatures w14:val="none"/>
-        </w:rPr>
-        <w:t>ipynb</w:t>
-      </w:r>
-      <w:proofErr w:type="gramEnd"/>
-      <w:r>
-        <w:rPr>
-          <w:rFonts w:ascii="Courier New" w:eastAsia="Times New Roman" w:hAnsi="Courier New" w:cs="Courier New"/>
-          <w:kern w:val="0"/>
-          <w:sz w:val="20"/>
-          <w:szCs w:val="20"/>
-          <w14:ligatures w14:val="none"/>
-        </w:rPr>
-        <w:t>_checkpoints</w:t>
-      </w:r>
-      <w:proofErr w:type="spellEnd"/>
-      <w:r>
-        <w:rPr>
-          <w:rFonts w:ascii="Courier New" w:eastAsia="Times New Roman" w:hAnsi="Courier New" w:cs="Courier New"/>
-          <w:kern w:val="0"/>
-          <w:sz w:val="20"/>
-          <w:szCs w:val="20"/>
-          <w14:ligatures w14:val="none"/>
-        </w:rPr>
-        <w:t>/</w:t>
+      <w:r>
+        <w:rPr>
+          <w:rFonts w:ascii="Courier New" w:eastAsia="Times New Roman" w:hAnsi="Courier New" w:cs="Courier New"/>
+          <w:kern w:val="0"/>
+          <w:sz w:val="20"/>
+          <w:szCs w:val="20"/>
+          <w14:ligatures w14:val="none"/>
+        </w:rPr>
+        <w:t>.ipynb_checkpoints/</w:t>
       </w:r>
     </w:p>
     <w:p>
@@ -1626,27 +1337,15 @@
           <w14:ligatures w14:val="none"/>
         </w:rPr>
       </w:pPr>
-      <w:proofErr w:type="spellStart"/>
-      <w:r>
-        <w:rPr>
-          <w:rFonts w:ascii="Courier New" w:eastAsia="Times New Roman" w:hAnsi="Courier New" w:cs="Courier New"/>
-          <w:kern w:val="0"/>
-          <w:sz w:val="20"/>
-          <w:szCs w:val="20"/>
-          <w14:ligatures w14:val="none"/>
-        </w:rPr>
-        <w:t>dist</w:t>
-      </w:r>
-      <w:proofErr w:type="spellEnd"/>
-      <w:r>
-        <w:rPr>
-          <w:rFonts w:ascii="Courier New" w:eastAsia="Times New Roman" w:hAnsi="Courier New" w:cs="Courier New"/>
-          <w:kern w:val="0"/>
-          <w:sz w:val="20"/>
-          <w:szCs w:val="20"/>
-          <w14:ligatures w14:val="none"/>
-        </w:rPr>
-        <w:t>/</w:t>
+      <w:r>
+        <w:rPr>
+          <w:rFonts w:ascii="Courier New" w:eastAsia="Times New Roman" w:hAnsi="Courier New" w:cs="Courier New"/>
+          <w:kern w:val="0"/>
+          <w:sz w:val="20"/>
+          <w:szCs w:val="20"/>
+          <w14:ligatures w14:val="none"/>
+        </w:rPr>
+        <w:t>dist/</w:t>
       </w:r>
     </w:p>
     <w:p>
@@ -1783,7 +1482,6 @@
           <w14:ligatures w14:val="none"/>
         </w:rPr>
       </w:pPr>
-      <w:proofErr w:type="gramStart"/>
       <w:r>
         <w:rPr>
           <w:rFonts w:ascii="Courier New" w:eastAsia="Times New Roman" w:hAnsi="Courier New" w:cs="Courier New"/>
@@ -1794,35 +1492,8 @@
           <w:szCs w:val="20"/>
           <w14:ligatures w14:val="none"/>
         </w:rPr>
-        <w:t>.</w:t>
-      </w:r>
-      <w:proofErr w:type="spellStart"/>
-      <w:r>
-        <w:rPr>
-          <w:rFonts w:ascii="Courier New" w:eastAsia="Times New Roman" w:hAnsi="Courier New" w:cs="Courier New"/>
-          <w:b/>
-          <w:bCs/>
-          <w:kern w:val="0"/>
-          <w:sz w:val="20"/>
-          <w:szCs w:val="20"/>
-          <w14:ligatures w14:val="none"/>
-        </w:rPr>
-        <w:t>env</w:t>
-      </w:r>
-      <w:proofErr w:type="gramEnd"/>
-      <w:r>
-        <w:rPr>
-          <w:rFonts w:ascii="Courier New" w:eastAsia="Times New Roman" w:hAnsi="Courier New" w:cs="Courier New"/>
-          <w:b/>
-          <w:bCs/>
-          <w:kern w:val="0"/>
-          <w:sz w:val="20"/>
-          <w:szCs w:val="20"/>
-          <w14:ligatures w14:val="none"/>
-        </w:rPr>
-        <w:t>.example</w:t>
-      </w:r>
-      <w:proofErr w:type="spellEnd"/>
+        <w:t>.env.example</w:t>
+      </w:r>
     </w:p>
     <w:p>
       <w:pPr>
@@ -1861,73 +1532,7 @@
           <w:szCs w:val="20"/>
           <w14:ligatures w14:val="none"/>
         </w:rPr>
-        <w:t># LLM provider (</w:t>
-      </w:r>
-      <w:proofErr w:type="spellStart"/>
-      <w:r>
-        <w:rPr>
-          <w:rFonts w:ascii="Courier New" w:eastAsia="Times New Roman" w:hAnsi="Courier New" w:cs="Courier New"/>
-          <w:kern w:val="0"/>
-          <w:sz w:val="20"/>
-          <w:szCs w:val="20"/>
-          <w14:ligatures w14:val="none"/>
-        </w:rPr>
-        <w:t>openai</w:t>
-      </w:r>
-      <w:proofErr w:type="spellEnd"/>
-      <w:r>
-        <w:rPr>
-          <w:rFonts w:ascii="Courier New" w:eastAsia="Times New Roman" w:hAnsi="Courier New" w:cs="Courier New"/>
-          <w:kern w:val="0"/>
-          <w:sz w:val="20"/>
-          <w:szCs w:val="20"/>
-          <w14:ligatures w14:val="none"/>
-        </w:rPr>
-        <w:t xml:space="preserve"> | </w:t>
-      </w:r>
-      <w:proofErr w:type="spellStart"/>
-      <w:r>
-        <w:rPr>
-          <w:rFonts w:ascii="Courier New" w:eastAsia="Times New Roman" w:hAnsi="Courier New" w:cs="Courier New"/>
-          <w:kern w:val="0"/>
-          <w:sz w:val="20"/>
-          <w:szCs w:val="20"/>
-          <w14:ligatures w14:val="none"/>
-        </w:rPr>
-        <w:t>ollama</w:t>
-      </w:r>
-      <w:proofErr w:type="spellEnd"/>
-      <w:r>
-        <w:rPr>
-          <w:rFonts w:ascii="Courier New" w:eastAsia="Times New Roman" w:hAnsi="Courier New" w:cs="Courier New"/>
-          <w:kern w:val="0"/>
-          <w:sz w:val="20"/>
-          <w:szCs w:val="20"/>
-          <w14:ligatures w14:val="none"/>
-        </w:rPr>
-        <w:t xml:space="preserve"> | hf | </w:t>
-      </w:r>
-      <w:proofErr w:type="spellStart"/>
-      <w:r>
-        <w:rPr>
-          <w:rFonts w:ascii="Courier New" w:eastAsia="Times New Roman" w:hAnsi="Courier New" w:cs="Courier New"/>
-          <w:kern w:val="0"/>
-          <w:sz w:val="20"/>
-          <w:szCs w:val="20"/>
-          <w14:ligatures w14:val="none"/>
-        </w:rPr>
-        <w:t>groq</w:t>
-      </w:r>
-      <w:proofErr w:type="spellEnd"/>
-      <w:r>
-        <w:rPr>
-          <w:rFonts w:ascii="Courier New" w:eastAsia="Times New Roman" w:hAnsi="Courier New" w:cs="Courier New"/>
-          <w:kern w:val="0"/>
-          <w:sz w:val="20"/>
-          <w:szCs w:val="20"/>
-          <w14:ligatures w14:val="none"/>
-        </w:rPr>
-        <w:t>)</w:t>
+        <w:t># LLM provider (openai | ollama | hf | groq)</w:t>
       </w:r>
     </w:p>
     <w:p>
@@ -1967,20 +1572,8 @@
           <w:szCs w:val="20"/>
           <w14:ligatures w14:val="none"/>
         </w:rPr>
-        <w:t>LLM_PROVIDER=</w:t>
-      </w:r>
-      <w:proofErr w:type="spellStart"/>
-      <w:r>
-        <w:rPr>
-          <w:rFonts w:ascii="Courier New" w:eastAsia="Times New Roman" w:hAnsi="Courier New" w:cs="Courier New"/>
-          <w:kern w:val="0"/>
-          <w:sz w:val="20"/>
-          <w:szCs w:val="20"/>
-          <w14:ligatures w14:val="none"/>
-        </w:rPr>
-        <w:t>ollama</w:t>
-      </w:r>
-      <w:proofErr w:type="spellEnd"/>
+        <w:t>LLM_PROVIDER=ollama</w:t>
+      </w:r>
     </w:p>
     <w:p>
       <w:pPr>
@@ -2089,20 +1682,8 @@
           <w:szCs w:val="20"/>
           <w14:ligatures w14:val="none"/>
         </w:rPr>
-        <w:t>OPENAI_API_KEY=</w:t>
-      </w:r>
-      <w:proofErr w:type="spellStart"/>
-      <w:r>
-        <w:rPr>
-          <w:rFonts w:ascii="Courier New" w:eastAsia="Times New Roman" w:hAnsi="Courier New" w:cs="Courier New"/>
-          <w:kern w:val="0"/>
-          <w:sz w:val="20"/>
-          <w:szCs w:val="20"/>
-          <w14:ligatures w14:val="none"/>
-        </w:rPr>
-        <w:t>your_key_here</w:t>
-      </w:r>
-      <w:proofErr w:type="spellEnd"/>
+        <w:t>OPENAI_API_KEY=your_key_here</w:t>
+      </w:r>
     </w:p>
     <w:p>
       <w:pPr>
@@ -2211,20 +1792,8 @@
           <w:szCs w:val="20"/>
           <w14:ligatures w14:val="none"/>
         </w:rPr>
-        <w:t>SERPAPI_KEY=</w:t>
-      </w:r>
-      <w:proofErr w:type="spellStart"/>
-      <w:r>
-        <w:rPr>
-          <w:rFonts w:ascii="Courier New" w:eastAsia="Times New Roman" w:hAnsi="Courier New" w:cs="Courier New"/>
-          <w:kern w:val="0"/>
-          <w:sz w:val="20"/>
-          <w:szCs w:val="20"/>
-          <w14:ligatures w14:val="none"/>
-        </w:rPr>
-        <w:t>your_key_here</w:t>
-      </w:r>
-      <w:proofErr w:type="spellEnd"/>
+        <w:t>SERPAPI_KEY=your_key_here</w:t>
+      </w:r>
     </w:p>
     <w:p>
       <w:pPr>
@@ -2431,20 +2000,8 @@
           <w:szCs w:val="20"/>
           <w14:ligatures w14:val="none"/>
         </w:rPr>
-        <w:t xml:space="preserve">git </w:t>
-      </w:r>
-      <w:proofErr w:type="gramStart"/>
-      <w:r>
-        <w:rPr>
-          <w:rFonts w:ascii="Courier New" w:eastAsia="Times New Roman" w:hAnsi="Courier New" w:cs="Courier New"/>
-          <w:kern w:val="0"/>
-          <w:sz w:val="20"/>
-          <w:szCs w:val="20"/>
-          <w14:ligatures w14:val="none"/>
-        </w:rPr>
-        <w:t>add .</w:t>
-      </w:r>
-      <w:proofErr w:type="gramEnd"/>
+        <w:t>git add .</w:t>
+      </w:r>
     </w:p>
     <w:p>
       <w:pPr>
@@ -2540,18 +2097,9 @@
           <w:rFonts w:ascii="Times New Roman" w:eastAsia="Times New Roman" w:hAnsi="Times New Roman" w:cs="Times New Roman"/>
           <w:noProof/>
           <w:kern w:val="0"/>
-          <w14:ligatures w14:val="none"/>
-        </w:rPr>
-      </w:r>
-      <w:r>
-        <w:rPr>
-          <w:rFonts w:ascii="Times New Roman" w:eastAsia="Times New Roman" w:hAnsi="Times New Roman" w:cs="Times New Roman"/>
-          <w:noProof/>
-          <w:kern w:val="0"/>
-          <w14:ligatures w14:val="none"/>
-        </w:rPr>
-        <w:pict w14:anchorId="68E582C9">
-          <v:rect id="_x0000_i1026" alt="" style="width:468pt;height:.05pt;mso-width-percent:0;mso-height-percent:0;mso-width-percent:0;mso-height-percent:0" o:hralign="center" o:hrstd="t" o:hr="t" fillcolor="#a0a0a0" stroked="f"/>
+        </w:rPr>
+        <w:pict w14:anchorId="2A21894C">
+          <v:rect id="_x0000_i1044" alt="" style="width:468pt;height:.05pt;mso-width-percent:0;mso-height-percent:0;mso-width-percent:0;mso-height-percent:0" o:hralign="center" o:hrstd="t" o:hr="t" fillcolor="#a0a0a0" stroked="f"/>
         </w:pict>
       </w:r>
     </w:p>
@@ -2665,20 +2213,8 @@
           <w:szCs w:val="20"/>
           <w14:ligatures w14:val="none"/>
         </w:rPr>
-        <w:t xml:space="preserve">poetry </w:t>
-      </w:r>
-      <w:proofErr w:type="spellStart"/>
-      <w:r>
-        <w:rPr>
-          <w:rFonts w:ascii="Courier New" w:eastAsia="Times New Roman" w:hAnsi="Courier New" w:cs="Courier New"/>
-          <w:kern w:val="0"/>
-          <w:sz w:val="20"/>
-          <w:szCs w:val="20"/>
-          <w14:ligatures w14:val="none"/>
-        </w:rPr>
-        <w:t>init</w:t>
-      </w:r>
-      <w:proofErr w:type="spellEnd"/>
+        <w:t>poetry init</w:t>
+      </w:r>
     </w:p>
     <w:p>
       <w:pPr>
@@ -2735,86 +2271,8 @@
           <w:szCs w:val="20"/>
           <w14:ligatures w14:val="none"/>
         </w:rPr>
-        <w:t xml:space="preserve">poetry add </w:t>
-      </w:r>
-      <w:proofErr w:type="spellStart"/>
-      <w:r>
-        <w:rPr>
-          <w:rFonts w:ascii="Courier New" w:eastAsia="Times New Roman" w:hAnsi="Courier New" w:cs="Courier New"/>
-          <w:kern w:val="0"/>
-          <w:sz w:val="20"/>
-          <w:szCs w:val="20"/>
-          <w14:ligatures w14:val="none"/>
-        </w:rPr>
-        <w:t>fastapi</w:t>
-      </w:r>
-      <w:proofErr w:type="spellEnd"/>
-      <w:r>
-        <w:rPr>
-          <w:rFonts w:ascii="Courier New" w:eastAsia="Times New Roman" w:hAnsi="Courier New" w:cs="Courier New"/>
-          <w:kern w:val="0"/>
-          <w:sz w:val="20"/>
-          <w:szCs w:val="20"/>
-          <w14:ligatures w14:val="none"/>
-        </w:rPr>
-        <w:t xml:space="preserve"> </w:t>
-      </w:r>
-      <w:proofErr w:type="spellStart"/>
-      <w:r>
-        <w:rPr>
-          <w:rFonts w:ascii="Courier New" w:eastAsia="Times New Roman" w:hAnsi="Courier New" w:cs="Courier New"/>
-          <w:kern w:val="0"/>
-          <w:sz w:val="20"/>
-          <w:szCs w:val="20"/>
-          <w14:ligatures w14:val="none"/>
-        </w:rPr>
-        <w:t>uvicorn</w:t>
-      </w:r>
-      <w:proofErr w:type="spellEnd"/>
-      <w:r>
-        <w:rPr>
-          <w:rFonts w:ascii="Courier New" w:eastAsia="Times New Roman" w:hAnsi="Courier New" w:cs="Courier New"/>
-          <w:kern w:val="0"/>
-          <w:sz w:val="20"/>
-          <w:szCs w:val="20"/>
-          <w14:ligatures w14:val="none"/>
-        </w:rPr>
-        <w:t xml:space="preserve"> </w:t>
-      </w:r>
-      <w:proofErr w:type="spellStart"/>
-      <w:r>
-        <w:rPr>
-          <w:rFonts w:ascii="Courier New" w:eastAsia="Times New Roman" w:hAnsi="Courier New" w:cs="Courier New"/>
-          <w:kern w:val="0"/>
-          <w:sz w:val="20"/>
-          <w:szCs w:val="20"/>
-          <w14:ligatures w14:val="none"/>
-        </w:rPr>
-        <w:t>pydantic</w:t>
-      </w:r>
-      <w:proofErr w:type="spellEnd"/>
-      <w:r>
-        <w:rPr>
-          <w:rFonts w:ascii="Courier New" w:eastAsia="Times New Roman" w:hAnsi="Courier New" w:cs="Courier New"/>
-          <w:kern w:val="0"/>
-          <w:sz w:val="20"/>
-          <w:szCs w:val="20"/>
-          <w14:ligatures w14:val="none"/>
-        </w:rPr>
-        <w:t>-settings python-</w:t>
-      </w:r>
-      <w:proofErr w:type="spellStart"/>
-      <w:r>
-        <w:rPr>
-          <w:rFonts w:ascii="Courier New" w:eastAsia="Times New Roman" w:hAnsi="Courier New" w:cs="Courier New"/>
-          <w:kern w:val="0"/>
-          <w:sz w:val="20"/>
-          <w:szCs w:val="20"/>
-          <w14:ligatures w14:val="none"/>
-        </w:rPr>
-        <w:t>dotenv</w:t>
-      </w:r>
-      <w:proofErr w:type="spellEnd"/>
+        <w:t>poetry add fastapi uvicorn pydantic-settings python-dotenv</w:t>
+      </w:r>
     </w:p>
     <w:p>
       <w:pPr>
@@ -2853,20 +2311,8 @@
           <w:szCs w:val="20"/>
           <w14:ligatures w14:val="none"/>
         </w:rPr>
-        <w:t xml:space="preserve">poetry add rich </w:t>
-      </w:r>
-      <w:proofErr w:type="spellStart"/>
-      <w:r>
-        <w:rPr>
-          <w:rFonts w:ascii="Courier New" w:eastAsia="Times New Roman" w:hAnsi="Courier New" w:cs="Courier New"/>
-          <w:kern w:val="0"/>
-          <w:sz w:val="20"/>
-          <w:szCs w:val="20"/>
-          <w14:ligatures w14:val="none"/>
-        </w:rPr>
-        <w:t>structlog</w:t>
-      </w:r>
-      <w:proofErr w:type="spellEnd"/>
+        <w:t>poetry add rich structlog</w:t>
+      </w:r>
     </w:p>
     <w:p>
       <w:pPr>
@@ -2905,29 +2351,7 @@
           <w:szCs w:val="20"/>
           <w14:ligatures w14:val="none"/>
         </w:rPr>
-        <w:t xml:space="preserve">poetry add </w:t>
-      </w:r>
-      <w:proofErr w:type="spellStart"/>
-      <w:r>
-        <w:rPr>
-          <w:rFonts w:ascii="Courier New" w:eastAsia="Times New Roman" w:hAnsi="Courier New" w:cs="Courier New"/>
-          <w:kern w:val="0"/>
-          <w:sz w:val="20"/>
-          <w:szCs w:val="20"/>
-          <w14:ligatures w14:val="none"/>
-        </w:rPr>
-        <w:t>httpx</w:t>
-      </w:r>
-      <w:proofErr w:type="spellEnd"/>
-      <w:r>
-        <w:rPr>
-          <w:rFonts w:ascii="Courier New" w:eastAsia="Times New Roman" w:hAnsi="Courier New" w:cs="Courier New"/>
-          <w:kern w:val="0"/>
-          <w:sz w:val="20"/>
-          <w:szCs w:val="20"/>
-          <w14:ligatures w14:val="none"/>
-        </w:rPr>
-        <w:t xml:space="preserve"> tenacity</w:t>
+        <w:t>poetry add httpx tenacity</w:t>
       </w:r>
     </w:p>
     <w:p>
@@ -2967,20 +2391,8 @@
           <w:szCs w:val="20"/>
           <w14:ligatures w14:val="none"/>
         </w:rPr>
-        <w:t xml:space="preserve">poetry add </w:t>
-      </w:r>
-      <w:proofErr w:type="spellStart"/>
-      <w:r>
-        <w:rPr>
-          <w:rFonts w:ascii="Courier New" w:eastAsia="Times New Roman" w:hAnsi="Courier New" w:cs="Courier New"/>
-          <w:kern w:val="0"/>
-          <w:sz w:val="20"/>
-          <w:szCs w:val="20"/>
-          <w14:ligatures w14:val="none"/>
-        </w:rPr>
-        <w:t>chromadb</w:t>
-      </w:r>
-      <w:proofErr w:type="spellEnd"/>
+        <w:t>poetry add chromadb</w:t>
+      </w:r>
     </w:p>
     <w:p>
       <w:pPr>
@@ -3059,64 +2471,8 @@
           <w:szCs w:val="20"/>
           <w14:ligatures w14:val="none"/>
         </w:rPr>
-        <w:t xml:space="preserve">poetry add --group dev </w:t>
-      </w:r>
-      <w:proofErr w:type="spellStart"/>
-      <w:r>
-        <w:rPr>
-          <w:rFonts w:ascii="Courier New" w:eastAsia="Times New Roman" w:hAnsi="Courier New" w:cs="Courier New"/>
-          <w:kern w:val="0"/>
-          <w:sz w:val="20"/>
-          <w:szCs w:val="20"/>
-          <w14:ligatures w14:val="none"/>
-        </w:rPr>
-        <w:t>pytest</w:t>
-      </w:r>
-      <w:proofErr w:type="spellEnd"/>
-      <w:r>
-        <w:rPr>
-          <w:rFonts w:ascii="Courier New" w:eastAsia="Times New Roman" w:hAnsi="Courier New" w:cs="Courier New"/>
-          <w:kern w:val="0"/>
-          <w:sz w:val="20"/>
-          <w:szCs w:val="20"/>
-          <w14:ligatures w14:val="none"/>
-        </w:rPr>
-        <w:t xml:space="preserve"> </w:t>
-      </w:r>
-      <w:proofErr w:type="spellStart"/>
-      <w:r>
-        <w:rPr>
-          <w:rFonts w:ascii="Courier New" w:eastAsia="Times New Roman" w:hAnsi="Courier New" w:cs="Courier New"/>
-          <w:kern w:val="0"/>
-          <w:sz w:val="20"/>
-          <w:szCs w:val="20"/>
-          <w14:ligatures w14:val="none"/>
-        </w:rPr>
-        <w:t>pytest-asyncio</w:t>
-      </w:r>
-      <w:proofErr w:type="spellEnd"/>
-      <w:r>
-        <w:rPr>
-          <w:rFonts w:ascii="Courier New" w:eastAsia="Times New Roman" w:hAnsi="Courier New" w:cs="Courier New"/>
-          <w:kern w:val="0"/>
-          <w:sz w:val="20"/>
-          <w:szCs w:val="20"/>
-          <w14:ligatures w14:val="none"/>
-        </w:rPr>
-        <w:t xml:space="preserve"> ruff black </w:t>
-      </w:r>
-      <w:proofErr w:type="spellStart"/>
-      <w:r>
-        <w:rPr>
-          <w:rFonts w:ascii="Courier New" w:eastAsia="Times New Roman" w:hAnsi="Courier New" w:cs="Courier New"/>
-          <w:kern w:val="0"/>
-          <w:sz w:val="20"/>
-          <w:szCs w:val="20"/>
-          <w14:ligatures w14:val="none"/>
-        </w:rPr>
-        <w:t>mypy</w:t>
-      </w:r>
-      <w:proofErr w:type="spellEnd"/>
+        <w:t>poetry add --group dev pytest pytest-asyncio ruff black mypy</w:t>
+      </w:r>
     </w:p>
     <w:p>
       <w:pPr>
@@ -3149,7 +2505,6 @@
           <w14:ligatures w14:val="none"/>
         </w:rPr>
       </w:pPr>
-      <w:proofErr w:type="spellStart"/>
       <w:r>
         <w:rPr>
           <w:rFonts w:ascii="Courier New" w:eastAsia="Times New Roman" w:hAnsi="Courier New" w:cs="Courier New"/>
@@ -3160,7 +2515,6 @@
         </w:rPr>
         <w:t>chromadb</w:t>
       </w:r>
-      <w:proofErr w:type="spellEnd"/>
       <w:r>
         <w:rPr>
           <w:rFonts w:ascii="Times New Roman" w:eastAsia="Times New Roman" w:hAnsi="Times New Roman" w:cs="Times New Roman"/>
@@ -3216,33 +2570,7 @@
           <w:szCs w:val="36"/>
           <w14:ligatures w14:val="none"/>
         </w:rPr>
-        <w:t xml:space="preserve">2.2 Create local </w:t>
-      </w:r>
-      <w:proofErr w:type="spellStart"/>
-      <w:r>
-        <w:rPr>
-          <w:rFonts w:ascii="Times New Roman" w:eastAsia="Times New Roman" w:hAnsi="Times New Roman" w:cs="Times New Roman"/>
-          <w:b/>
-          <w:bCs/>
-          <w:kern w:val="0"/>
-          <w:sz w:val="36"/>
-          <w:szCs w:val="36"/>
-          <w14:ligatures w14:val="none"/>
-        </w:rPr>
-        <w:t>venv</w:t>
-      </w:r>
-      <w:proofErr w:type="spellEnd"/>
-      <w:r>
-        <w:rPr>
-          <w:rFonts w:ascii="Times New Roman" w:eastAsia="Times New Roman" w:hAnsi="Times New Roman" w:cs="Times New Roman"/>
-          <w:b/>
-          <w:bCs/>
-          <w:kern w:val="0"/>
-          <w:sz w:val="36"/>
-          <w:szCs w:val="36"/>
-          <w14:ligatures w14:val="none"/>
-        </w:rPr>
-        <w:t xml:space="preserve"> via Poetry</w:t>
+        <w:t>2.2 Create local venv via Poetry</w:t>
       </w:r>
     </w:p>
     <w:p>
@@ -3282,20 +2610,8 @@
           <w:szCs w:val="20"/>
           <w14:ligatures w14:val="none"/>
         </w:rPr>
-        <w:t xml:space="preserve">poetry </w:t>
-      </w:r>
-      <w:proofErr w:type="gramStart"/>
-      <w:r>
-        <w:rPr>
-          <w:rFonts w:ascii="Courier New" w:eastAsia="Times New Roman" w:hAnsi="Courier New" w:cs="Courier New"/>
-          <w:kern w:val="0"/>
-          <w:sz w:val="20"/>
-          <w:szCs w:val="20"/>
-          <w14:ligatures w14:val="none"/>
-        </w:rPr>
-        <w:t>install</w:t>
-      </w:r>
-      <w:proofErr w:type="gramEnd"/>
+        <w:t>poetry install</w:t>
+      </w:r>
     </w:p>
     <w:p>
       <w:pPr>
@@ -3351,18 +2667,9 @@
           <w:rFonts w:ascii="Times New Roman" w:eastAsia="Times New Roman" w:hAnsi="Times New Roman" w:cs="Times New Roman"/>
           <w:noProof/>
           <w:kern w:val="0"/>
-          <w14:ligatures w14:val="none"/>
-        </w:rPr>
-      </w:r>
-      <w:r>
-        <w:rPr>
-          <w:rFonts w:ascii="Times New Roman" w:eastAsia="Times New Roman" w:hAnsi="Times New Roman" w:cs="Times New Roman"/>
-          <w:noProof/>
-          <w:kern w:val="0"/>
-          <w14:ligatures w14:val="none"/>
-        </w:rPr>
-        <w:pict w14:anchorId="47D751CE">
-          <v:rect id="_x0000_i1027" alt="" style="width:468pt;height:.05pt;mso-width-percent:0;mso-height-percent:0;mso-width-percent:0;mso-height-percent:0" o:hralign="center" o:hrstd="t" o:hr="t" fillcolor="#a0a0a0" stroked="f"/>
+        </w:rPr>
+        <w:pict w14:anchorId="55001A54">
+          <v:rect id="_x0000_i1043" alt="" style="width:468pt;height:.05pt;mso-width-percent:0;mso-height-percent:0;mso-width-percent:0;mso-height-percent:0" o:hralign="center" o:hrstd="t" o:hr="t" fillcolor="#a0a0a0" stroked="f"/>
         </w:pict>
       </w:r>
     </w:p>
@@ -3440,27 +2747,15 @@
           <w14:ligatures w14:val="none"/>
         </w:rPr>
       </w:pPr>
-      <w:proofErr w:type="spellStart"/>
-      <w:r>
-        <w:rPr>
-          <w:rFonts w:ascii="Courier New" w:eastAsia="Times New Roman" w:hAnsi="Courier New" w:cs="Courier New"/>
-          <w:kern w:val="0"/>
-          <w:sz w:val="20"/>
-          <w:szCs w:val="20"/>
-          <w14:ligatures w14:val="none"/>
-        </w:rPr>
-        <w:t>careeros</w:t>
-      </w:r>
-      <w:proofErr w:type="spellEnd"/>
-      <w:r>
-        <w:rPr>
-          <w:rFonts w:ascii="Courier New" w:eastAsia="Times New Roman" w:hAnsi="Courier New" w:cs="Courier New"/>
-          <w:kern w:val="0"/>
-          <w:sz w:val="20"/>
-          <w:szCs w:val="20"/>
-          <w14:ligatures w14:val="none"/>
-        </w:rPr>
-        <w:t>/</w:t>
+      <w:r>
+        <w:rPr>
+          <w:rFonts w:ascii="Courier New" w:eastAsia="Times New Roman" w:hAnsi="Courier New" w:cs="Courier New"/>
+          <w:kern w:val="0"/>
+          <w:sz w:val="20"/>
+          <w:szCs w:val="20"/>
+          <w14:ligatures w14:val="none"/>
+        </w:rPr>
+        <w:t>careeros/</w:t>
       </w:r>
     </w:p>
     <w:p>
@@ -3580,29 +2875,7 @@
           <w:szCs w:val="20"/>
           <w14:ligatures w14:val="none"/>
         </w:rPr>
-        <w:t xml:space="preserve">      </w:t>
-      </w:r>
-      <w:proofErr w:type="spellStart"/>
-      <w:r>
-        <w:rPr>
-          <w:rFonts w:ascii="Courier New" w:eastAsia="Times New Roman" w:hAnsi="Courier New" w:cs="Courier New"/>
-          <w:kern w:val="0"/>
-          <w:sz w:val="20"/>
-          <w:szCs w:val="20"/>
-          <w14:ligatures w14:val="none"/>
-        </w:rPr>
-        <w:t>api</w:t>
-      </w:r>
-      <w:proofErr w:type="spellEnd"/>
-      <w:r>
-        <w:rPr>
-          <w:rFonts w:ascii="Courier New" w:eastAsia="Times New Roman" w:hAnsi="Courier New" w:cs="Courier New"/>
-          <w:kern w:val="0"/>
-          <w:sz w:val="20"/>
-          <w:szCs w:val="20"/>
-          <w14:ligatures w14:val="none"/>
-        </w:rPr>
-        <w:t>/</w:t>
+        <w:t xml:space="preserve">      api/</w:t>
       </w:r>
     </w:p>
     <w:p>
@@ -3842,29 +3115,7 @@
           <w:szCs w:val="20"/>
           <w14:ligatures w14:val="none"/>
         </w:rPr>
-        <w:t xml:space="preserve">      </w:t>
-      </w:r>
-      <w:proofErr w:type="spellStart"/>
-      <w:r>
-        <w:rPr>
-          <w:rFonts w:ascii="Courier New" w:eastAsia="Times New Roman" w:hAnsi="Courier New" w:cs="Courier New"/>
-          <w:kern w:val="0"/>
-          <w:sz w:val="20"/>
-          <w:szCs w:val="20"/>
-          <w14:ligatures w14:val="none"/>
-        </w:rPr>
-        <w:t>db</w:t>
-      </w:r>
-      <w:proofErr w:type="spellEnd"/>
-      <w:r>
-        <w:rPr>
-          <w:rFonts w:ascii="Courier New" w:eastAsia="Times New Roman" w:hAnsi="Courier New" w:cs="Courier New"/>
-          <w:kern w:val="0"/>
-          <w:sz w:val="20"/>
-          <w:szCs w:val="20"/>
-          <w14:ligatures w14:val="none"/>
-        </w:rPr>
-        <w:t>/</w:t>
+        <w:t xml:space="preserve">      db/</w:t>
       </w:r>
     </w:p>
     <w:p>
@@ -3984,31 +3235,7 @@
           <w:szCs w:val="20"/>
           <w14:ligatures w14:val="none"/>
         </w:rPr>
-        <w:t xml:space="preserve">    </w:t>
-      </w:r>
-      <w:proofErr w:type="spellStart"/>
-      <w:proofErr w:type="gramStart"/>
-      <w:r>
-        <w:rPr>
-          <w:rFonts w:ascii="Courier New" w:eastAsia="Times New Roman" w:hAnsi="Courier New" w:cs="Courier New"/>
-          <w:kern w:val="0"/>
-          <w:sz w:val="20"/>
-          <w:szCs w:val="20"/>
-          <w14:ligatures w14:val="none"/>
-        </w:rPr>
-        <w:t>pyproject.toml</w:t>
-      </w:r>
-      <w:proofErr w:type="spellEnd"/>
-      <w:proofErr w:type="gramEnd"/>
-      <w:r>
-        <w:rPr>
-          <w:rFonts w:ascii="Courier New" w:eastAsia="Times New Roman" w:hAnsi="Courier New" w:cs="Courier New"/>
-          <w:kern w:val="0"/>
-          <w:sz w:val="20"/>
-          <w:szCs w:val="20"/>
-          <w14:ligatures w14:val="none"/>
-        </w:rPr>
-        <w:t xml:space="preserve"> (root)</w:t>
+        <w:t xml:space="preserve">    pyproject.toml (root)</w:t>
       </w:r>
     </w:p>
     <w:p>
@@ -4169,20 +3396,8 @@
           <w:szCs w:val="20"/>
           <w14:ligatures w14:val="none"/>
         </w:rPr>
-        <w:t xml:space="preserve">    01_rag_</w:t>
-      </w:r>
-      <w:proofErr w:type="gramStart"/>
-      <w:r>
-        <w:rPr>
-          <w:rFonts w:ascii="Courier New" w:eastAsia="Times New Roman" w:hAnsi="Courier New" w:cs="Courier New"/>
-          <w:kern w:val="0"/>
-          <w:sz w:val="20"/>
-          <w:szCs w:val="20"/>
-          <w14:ligatures w14:val="none"/>
-        </w:rPr>
-        <w:t>basics.ipynb</w:t>
-      </w:r>
-      <w:proofErr w:type="gramEnd"/>
+        <w:t xml:space="preserve">    01_rag_basics.ipynb</w:t>
+      </w:r>
     </w:p>
     <w:p>
       <w:pPr>
@@ -4221,20 +3436,8 @@
           <w:szCs w:val="20"/>
           <w14:ligatures w14:val="none"/>
         </w:rPr>
-        <w:t xml:space="preserve">    02_job_</w:t>
-      </w:r>
-      <w:proofErr w:type="gramStart"/>
-      <w:r>
-        <w:rPr>
-          <w:rFonts w:ascii="Courier New" w:eastAsia="Times New Roman" w:hAnsi="Courier New" w:cs="Courier New"/>
-          <w:kern w:val="0"/>
-          <w:sz w:val="20"/>
-          <w:szCs w:val="20"/>
-          <w14:ligatures w14:val="none"/>
-        </w:rPr>
-        <w:t>matching.ipynb</w:t>
-      </w:r>
-      <w:proofErr w:type="gramEnd"/>
+        <w:t xml:space="preserve">    02_job_matching.ipynb</w:t>
+      </w:r>
     </w:p>
     <w:p>
       <w:pPr>
@@ -4273,20 +3476,8 @@
           <w:szCs w:val="20"/>
           <w14:ligatures w14:val="none"/>
         </w:rPr>
-        <w:t xml:space="preserve">    03_resume_</w:t>
-      </w:r>
-      <w:proofErr w:type="gramStart"/>
-      <w:r>
-        <w:rPr>
-          <w:rFonts w:ascii="Courier New" w:eastAsia="Times New Roman" w:hAnsi="Courier New" w:cs="Courier New"/>
-          <w:kern w:val="0"/>
-          <w:sz w:val="20"/>
-          <w:szCs w:val="20"/>
-          <w14:ligatures w14:val="none"/>
-        </w:rPr>
-        <w:t>tailer.ipynb</w:t>
-      </w:r>
-      <w:proofErr w:type="gramEnd"/>
+        <w:t xml:space="preserve">    03_resume_tailer.ipynb</w:t>
+      </w:r>
     </w:p>
     <w:p>
       <w:pPr>
@@ -4525,41 +3716,7 @@
           <w:szCs w:val="20"/>
           <w14:ligatures w14:val="none"/>
         </w:rPr>
-        <w:t xml:space="preserve">  </w:t>
-      </w:r>
-      <w:proofErr w:type="gramStart"/>
-      <w:r>
-        <w:rPr>
-          <w:rFonts w:ascii="Courier New" w:eastAsia="Times New Roman" w:hAnsi="Courier New" w:cs="Courier New"/>
-          <w:kern w:val="0"/>
-          <w:sz w:val="20"/>
-          <w:szCs w:val="20"/>
-          <w14:ligatures w14:val="none"/>
-        </w:rPr>
-        <w:t>.</w:t>
-      </w:r>
-      <w:proofErr w:type="spellStart"/>
-      <w:r>
-        <w:rPr>
-          <w:rFonts w:ascii="Courier New" w:eastAsia="Times New Roman" w:hAnsi="Courier New" w:cs="Courier New"/>
-          <w:kern w:val="0"/>
-          <w:sz w:val="20"/>
-          <w:szCs w:val="20"/>
-          <w14:ligatures w14:val="none"/>
-        </w:rPr>
-        <w:t>github</w:t>
-      </w:r>
-      <w:proofErr w:type="spellEnd"/>
-      <w:proofErr w:type="gramEnd"/>
-      <w:r>
-        <w:rPr>
-          <w:rFonts w:ascii="Courier New" w:eastAsia="Times New Roman" w:hAnsi="Courier New" w:cs="Courier New"/>
-          <w:kern w:val="0"/>
-          <w:sz w:val="20"/>
-          <w:szCs w:val="20"/>
-          <w14:ligatures w14:val="none"/>
-        </w:rPr>
-        <w:t>/workflows/</w:t>
+        <w:t xml:space="preserve">  .github/workflows/</w:t>
       </w:r>
     </w:p>
     <w:p>
@@ -4599,20 +3756,8 @@
           <w:szCs w:val="20"/>
           <w14:ligatures w14:val="none"/>
         </w:rPr>
-        <w:t xml:space="preserve">    </w:t>
-      </w:r>
-      <w:proofErr w:type="spellStart"/>
-      <w:r>
-        <w:rPr>
-          <w:rFonts w:ascii="Courier New" w:eastAsia="Times New Roman" w:hAnsi="Courier New" w:cs="Courier New"/>
-          <w:kern w:val="0"/>
-          <w:sz w:val="20"/>
-          <w:szCs w:val="20"/>
-          <w14:ligatures w14:val="none"/>
-        </w:rPr>
-        <w:t>ci.yml</w:t>
-      </w:r>
-      <w:proofErr w:type="spellEnd"/>
+        <w:t xml:space="preserve">    ci.yml</w:t>
+      </w:r>
     </w:p>
     <w:p>
       <w:pPr>
@@ -4628,18 +3773,9 @@
           <w:rFonts w:ascii="Times New Roman" w:eastAsia="Times New Roman" w:hAnsi="Times New Roman" w:cs="Times New Roman"/>
           <w:noProof/>
           <w:kern w:val="0"/>
-          <w14:ligatures w14:val="none"/>
-        </w:rPr>
-      </w:r>
-      <w:r>
-        <w:rPr>
-          <w:rFonts w:ascii="Times New Roman" w:eastAsia="Times New Roman" w:hAnsi="Times New Roman" w:cs="Times New Roman"/>
-          <w:noProof/>
-          <w:kern w:val="0"/>
-          <w14:ligatures w14:val="none"/>
-        </w:rPr>
-        <w:pict w14:anchorId="2A6A1E2F">
-          <v:rect id="_x0000_i1028" alt="" style="width:468pt;height:.05pt;mso-width-percent:0;mso-height-percent:0;mso-width-percent:0;mso-height-percent:0" o:hralign="center" o:hrstd="t" o:hr="t" fillcolor="#a0a0a0" stroked="f"/>
+        </w:rPr>
+        <w:pict w14:anchorId="73B32CCB">
+          <v:rect id="_x0000_i1042" alt="" style="width:468pt;height:.05pt;mso-width-percent:0;mso-height-percent:0;mso-width-percent:0;mso-height-percent:0" o:hralign="center" o:hrstd="t" o:hr="t" fillcolor="#a0a0a0" stroked="f"/>
         </w:pict>
       </w:r>
     </w:p>
@@ -4694,33 +3830,7 @@
           <w:szCs w:val="36"/>
           <w14:ligatures w14:val="none"/>
         </w:rPr>
-        <w:t>4.1 Config management (</w:t>
-      </w:r>
-      <w:proofErr w:type="spellStart"/>
-      <w:r>
-        <w:rPr>
-          <w:rFonts w:ascii="Times New Roman" w:eastAsia="Times New Roman" w:hAnsi="Times New Roman" w:cs="Times New Roman"/>
-          <w:b/>
-          <w:bCs/>
-          <w:kern w:val="0"/>
-          <w:sz w:val="36"/>
-          <w:szCs w:val="36"/>
-          <w14:ligatures w14:val="none"/>
-        </w:rPr>
-        <w:t>Pydantic</w:t>
-      </w:r>
-      <w:proofErr w:type="spellEnd"/>
-      <w:r>
-        <w:rPr>
-          <w:rFonts w:ascii="Times New Roman" w:eastAsia="Times New Roman" w:hAnsi="Times New Roman" w:cs="Times New Roman"/>
-          <w:b/>
-          <w:bCs/>
-          <w:kern w:val="0"/>
-          <w:sz w:val="36"/>
-          <w:szCs w:val="36"/>
-          <w14:ligatures w14:val="none"/>
-        </w:rPr>
-        <w:t xml:space="preserve"> settings)</w:t>
+        <w:t>4.1 Config management (Pydantic settings)</w:t>
       </w:r>
     </w:p>
     <w:p>
@@ -4893,7 +4003,6 @@
         </w:rPr>
         <w:t xml:space="preserve">use </w:t>
       </w:r>
-      <w:proofErr w:type="spellStart"/>
       <w:r>
         <w:rPr>
           <w:rFonts w:ascii="Courier New" w:eastAsia="Times New Roman" w:hAnsi="Courier New" w:cs="Courier New"/>
@@ -4904,7 +4013,6 @@
         </w:rPr>
         <w:t>structlog</w:t>
       </w:r>
-      <w:proofErr w:type="spellEnd"/>
       <w:r>
         <w:rPr>
           <w:rFonts w:ascii="Times New Roman" w:eastAsia="Times New Roman" w:hAnsi="Times New Roman" w:cs="Times New Roman"/>
@@ -5048,7 +4156,6 @@
           <w14:ligatures w14:val="none"/>
         </w:rPr>
       </w:pPr>
-      <w:proofErr w:type="spellStart"/>
       <w:r>
         <w:rPr>
           <w:rFonts w:ascii="Courier New" w:eastAsia="Times New Roman" w:hAnsi="Courier New" w:cs="Courier New"/>
@@ -5059,7 +4166,6 @@
         </w:rPr>
         <w:t>error_code</w:t>
       </w:r>
-      <w:proofErr w:type="spellEnd"/>
     </w:p>
     <w:p>
       <w:pPr>
@@ -5098,7 +4204,6 @@
           <w14:ligatures w14:val="none"/>
         </w:rPr>
       </w:pPr>
-      <w:proofErr w:type="spellStart"/>
       <w:r>
         <w:rPr>
           <w:rFonts w:ascii="Courier New" w:eastAsia="Times New Roman" w:hAnsi="Courier New" w:cs="Courier New"/>
@@ -5109,7 +4214,6 @@
         </w:rPr>
         <w:t>request_id</w:t>
       </w:r>
-      <w:proofErr w:type="spellEnd"/>
     </w:p>
     <w:p>
       <w:pPr>
@@ -5188,18 +4292,9 @@
           <w:rFonts w:ascii="Times New Roman" w:eastAsia="Times New Roman" w:hAnsi="Times New Roman" w:cs="Times New Roman"/>
           <w:noProof/>
           <w:kern w:val="0"/>
-          <w14:ligatures w14:val="none"/>
-        </w:rPr>
-      </w:r>
-      <w:r>
-        <w:rPr>
-          <w:rFonts w:ascii="Times New Roman" w:eastAsia="Times New Roman" w:hAnsi="Times New Roman" w:cs="Times New Roman"/>
-          <w:noProof/>
-          <w:kern w:val="0"/>
-          <w14:ligatures w14:val="none"/>
-        </w:rPr>
-        <w:pict w14:anchorId="4414BC74">
-          <v:rect id="_x0000_i1029" alt="" style="width:468pt;height:.05pt;mso-width-percent:0;mso-height-percent:0;mso-width-percent:0;mso-height-percent:0" o:hralign="center" o:hrstd="t" o:hr="t" fillcolor="#a0a0a0" stroked="f"/>
+        </w:rPr>
+        <w:pict w14:anchorId="5105F2B5">
+          <v:rect id="_x0000_i1041" alt="" style="width:468pt;height:.05pt;mso-width-percent:0;mso-height-percent:0;mso-width-percent:0;mso-height-percent:0" o:hralign="center" o:hrstd="t" o:hr="t" fillcolor="#a0a0a0" stroked="f"/>
         </w:pict>
       </w:r>
     </w:p>
@@ -5227,33 +4322,7 @@
           <w:szCs w:val="48"/>
           <w14:ligatures w14:val="none"/>
         </w:rPr>
-        <w:t xml:space="preserve">Phase 5 — Backend </w:t>
-      </w:r>
-      <w:proofErr w:type="spellStart"/>
-      <w:r>
-        <w:rPr>
-          <w:rFonts w:ascii="Times New Roman" w:eastAsia="Times New Roman" w:hAnsi="Times New Roman" w:cs="Times New Roman"/>
-          <w:b/>
-          <w:bCs/>
-          <w:kern w:val="36"/>
-          <w:sz w:val="48"/>
-          <w:szCs w:val="48"/>
-          <w14:ligatures w14:val="none"/>
-        </w:rPr>
-        <w:t>FastAPI</w:t>
-      </w:r>
-      <w:proofErr w:type="spellEnd"/>
-      <w:r>
-        <w:rPr>
-          <w:rFonts w:ascii="Times New Roman" w:eastAsia="Times New Roman" w:hAnsi="Times New Roman" w:cs="Times New Roman"/>
-          <w:b/>
-          <w:bCs/>
-          <w:kern w:val="36"/>
-          <w:sz w:val="48"/>
-          <w:szCs w:val="48"/>
-          <w14:ligatures w14:val="none"/>
-        </w:rPr>
-        <w:t xml:space="preserve"> “Hello + Health + Version” (Day 3)</w:t>
+        <w:t>Phase 5 — Backend FastAPI “Hello + Health + Version” (Day 3)</w:t>
       </w:r>
     </w:p>
     <w:p>
@@ -5413,63 +4482,7 @@
           <w:szCs w:val="20"/>
           <w14:ligatures w14:val="none"/>
         </w:rPr>
-        <w:t xml:space="preserve">poetry run </w:t>
-      </w:r>
-      <w:proofErr w:type="spellStart"/>
-      <w:r>
-        <w:rPr>
-          <w:rFonts w:ascii="Courier New" w:eastAsia="Times New Roman" w:hAnsi="Courier New" w:cs="Courier New"/>
-          <w:kern w:val="0"/>
-          <w:sz w:val="20"/>
-          <w:szCs w:val="20"/>
-          <w14:ligatures w14:val="none"/>
-        </w:rPr>
-        <w:t>uvicorn</w:t>
-      </w:r>
-      <w:proofErr w:type="spellEnd"/>
-      <w:r>
-        <w:rPr>
-          <w:rFonts w:ascii="Courier New" w:eastAsia="Times New Roman" w:hAnsi="Courier New" w:cs="Courier New"/>
-          <w:kern w:val="0"/>
-          <w:sz w:val="20"/>
-          <w:szCs w:val="20"/>
-          <w14:ligatures w14:val="none"/>
-        </w:rPr>
-        <w:t xml:space="preserve"> </w:t>
-      </w:r>
-      <w:proofErr w:type="spellStart"/>
-      <w:proofErr w:type="gramStart"/>
-      <w:r>
-        <w:rPr>
-          <w:rFonts w:ascii="Courier New" w:eastAsia="Times New Roman" w:hAnsi="Courier New" w:cs="Courier New"/>
-          <w:kern w:val="0"/>
-          <w:sz w:val="20"/>
-          <w:szCs w:val="20"/>
-          <w14:ligatures w14:val="none"/>
-        </w:rPr>
-        <w:t>backend.app.main</w:t>
-      </w:r>
-      <w:proofErr w:type="gramEnd"/>
-      <w:r>
-        <w:rPr>
-          <w:rFonts w:ascii="Courier New" w:eastAsia="Times New Roman" w:hAnsi="Courier New" w:cs="Courier New"/>
-          <w:kern w:val="0"/>
-          <w:sz w:val="20"/>
-          <w:szCs w:val="20"/>
-          <w14:ligatures w14:val="none"/>
-        </w:rPr>
-        <w:t>:app</w:t>
-      </w:r>
-      <w:proofErr w:type="spellEnd"/>
-      <w:r>
-        <w:rPr>
-          <w:rFonts w:ascii="Courier New" w:eastAsia="Times New Roman" w:hAnsi="Courier New" w:cs="Courier New"/>
-          <w:kern w:val="0"/>
-          <w:sz w:val="20"/>
-          <w:szCs w:val="20"/>
-          <w14:ligatures w14:val="none"/>
-        </w:rPr>
-        <w:t xml:space="preserve"> --reload</w:t>
+        <w:t>poetry run uvicorn backend.app.main:app --reload</w:t>
       </w:r>
     </w:p>
     <w:p>
@@ -5528,18 +4541,9 @@
           <w:rFonts w:ascii="Times New Roman" w:eastAsia="Times New Roman" w:hAnsi="Times New Roman" w:cs="Times New Roman"/>
           <w:noProof/>
           <w:kern w:val="0"/>
-          <w14:ligatures w14:val="none"/>
-        </w:rPr>
-      </w:r>
-      <w:r>
-        <w:rPr>
-          <w:rFonts w:ascii="Times New Roman" w:eastAsia="Times New Roman" w:hAnsi="Times New Roman" w:cs="Times New Roman"/>
-          <w:noProof/>
-          <w:kern w:val="0"/>
-          <w14:ligatures w14:val="none"/>
-        </w:rPr>
-        <w:pict w14:anchorId="6A8E7DA3">
-          <v:rect id="_x0000_i1030" alt="" style="width:468pt;height:.05pt;mso-width-percent:0;mso-height-percent:0;mso-width-percent:0;mso-height-percent:0" o:hralign="center" o:hrstd="t" o:hr="t" fillcolor="#a0a0a0" stroked="f"/>
+        </w:rPr>
+        <w:pict w14:anchorId="342DD479">
+          <v:rect id="_x0000_i1040" alt="" style="width:468pt;height:.05pt;mso-width-percent:0;mso-height-percent:0;mso-width-percent:0;mso-height-percent:0" o:hralign="center" o:hrstd="t" o:hr="t" fillcolor="#a0a0a0" stroked="f"/>
         </w:pict>
       </w:r>
     </w:p>
@@ -5567,33 +4571,7 @@
           <w:szCs w:val="48"/>
           <w14:ligatures w14:val="none"/>
         </w:rPr>
-        <w:t>Phase 6 — Testing Foundation (</w:t>
-      </w:r>
-      <w:proofErr w:type="spellStart"/>
-      <w:r>
-        <w:rPr>
-          <w:rFonts w:ascii="Times New Roman" w:eastAsia="Times New Roman" w:hAnsi="Times New Roman" w:cs="Times New Roman"/>
-          <w:b/>
-          <w:bCs/>
-          <w:kern w:val="36"/>
-          <w:sz w:val="48"/>
-          <w:szCs w:val="48"/>
-          <w14:ligatures w14:val="none"/>
-        </w:rPr>
-        <w:t>Pytest</w:t>
-      </w:r>
-      <w:proofErr w:type="spellEnd"/>
-      <w:r>
-        <w:rPr>
-          <w:rFonts w:ascii="Times New Roman" w:eastAsia="Times New Roman" w:hAnsi="Times New Roman" w:cs="Times New Roman"/>
-          <w:b/>
-          <w:bCs/>
-          <w:kern w:val="36"/>
-          <w:sz w:val="48"/>
-          <w:szCs w:val="48"/>
-          <w14:ligatures w14:val="none"/>
-        </w:rPr>
-        <w:t xml:space="preserve"> + API tests) (Day 3–4)</w:t>
+        <w:t>Phase 6 — Testing Foundation (Pytest + API tests) (Day 3–4)</w:t>
       </w:r>
     </w:p>
     <w:p>
@@ -5679,32 +4657,8 @@
           <w:szCs w:val="20"/>
           <w14:ligatures w14:val="none"/>
         </w:rPr>
-        <w:t xml:space="preserve">poetry run </w:t>
-      </w:r>
-      <w:proofErr w:type="spellStart"/>
-      <w:proofErr w:type="gramStart"/>
-      <w:r>
-        <w:rPr>
-          <w:rFonts w:ascii="Courier New" w:eastAsia="Times New Roman" w:hAnsi="Courier New" w:cs="Courier New"/>
-          <w:kern w:val="0"/>
-          <w:sz w:val="20"/>
-          <w:szCs w:val="20"/>
-          <w14:ligatures w14:val="none"/>
-        </w:rPr>
-        <w:t>pytest</w:t>
-      </w:r>
-      <w:proofErr w:type="spellEnd"/>
-      <w:r>
-        <w:rPr>
-          <w:rFonts w:ascii="Courier New" w:eastAsia="Times New Roman" w:hAnsi="Courier New" w:cs="Courier New"/>
-          <w:kern w:val="0"/>
-          <w:sz w:val="20"/>
-          <w:szCs w:val="20"/>
-          <w14:ligatures w14:val="none"/>
-        </w:rPr>
-        <w:t xml:space="preserve"> -q</w:t>
-      </w:r>
-      <w:proofErr w:type="gramEnd"/>
+        <w:t>poetry run pytest -q</w:t>
+      </w:r>
     </w:p>
     <w:p>
       <w:pPr>
@@ -5761,20 +4715,8 @@
           <w:szCs w:val="20"/>
           <w14:ligatures w14:val="none"/>
         </w:rPr>
-        <w:t xml:space="preserve">poetry add --group dev </w:t>
-      </w:r>
-      <w:proofErr w:type="spellStart"/>
-      <w:r>
-        <w:rPr>
-          <w:rFonts w:ascii="Courier New" w:eastAsia="Times New Roman" w:hAnsi="Courier New" w:cs="Courier New"/>
-          <w:kern w:val="0"/>
-          <w:sz w:val="20"/>
-          <w:szCs w:val="20"/>
-          <w14:ligatures w14:val="none"/>
-        </w:rPr>
-        <w:t>pytest-cov</w:t>
-      </w:r>
-      <w:proofErr w:type="spellEnd"/>
+        <w:t>poetry add --group dev pytest-cov</w:t>
+      </w:r>
     </w:p>
     <w:p>
       <w:pPr>
@@ -5813,42 +4755,8 @@
           <w:szCs w:val="20"/>
           <w14:ligatures w14:val="none"/>
         </w:rPr>
-        <w:t xml:space="preserve">poetry run </w:t>
-      </w:r>
-      <w:proofErr w:type="spellStart"/>
-      <w:r>
-        <w:rPr>
-          <w:rFonts w:ascii="Courier New" w:eastAsia="Times New Roman" w:hAnsi="Courier New" w:cs="Courier New"/>
-          <w:kern w:val="0"/>
-          <w:sz w:val="20"/>
-          <w:szCs w:val="20"/>
-          <w14:ligatures w14:val="none"/>
-        </w:rPr>
-        <w:t>pytest</w:t>
-      </w:r>
-      <w:proofErr w:type="spellEnd"/>
-      <w:r>
-        <w:rPr>
-          <w:rFonts w:ascii="Courier New" w:eastAsia="Times New Roman" w:hAnsi="Courier New" w:cs="Courier New"/>
-          <w:kern w:val="0"/>
-          <w:sz w:val="20"/>
-          <w:szCs w:val="20"/>
-          <w14:ligatures w14:val="none"/>
-        </w:rPr>
-        <w:t xml:space="preserve"> --</w:t>
-      </w:r>
-      <w:proofErr w:type="spellStart"/>
-      <w:r>
-        <w:rPr>
-          <w:rFonts w:ascii="Courier New" w:eastAsia="Times New Roman" w:hAnsi="Courier New" w:cs="Courier New"/>
-          <w:kern w:val="0"/>
-          <w:sz w:val="20"/>
-          <w:szCs w:val="20"/>
-          <w14:ligatures w14:val="none"/>
-        </w:rPr>
-        <w:t>cov</w:t>
-      </w:r>
-      <w:proofErr w:type="spellEnd"/>
+        <w:t>poetry run pytest --cov</w:t>
+      </w:r>
     </w:p>
     <w:p>
       <w:pPr>
@@ -5864,18 +4772,9 @@
           <w:rFonts w:ascii="Times New Roman" w:eastAsia="Times New Roman" w:hAnsi="Times New Roman" w:cs="Times New Roman"/>
           <w:noProof/>
           <w:kern w:val="0"/>
-          <w14:ligatures w14:val="none"/>
-        </w:rPr>
-      </w:r>
-      <w:r>
-        <w:rPr>
-          <w:rFonts w:ascii="Times New Roman" w:eastAsia="Times New Roman" w:hAnsi="Times New Roman" w:cs="Times New Roman"/>
-          <w:noProof/>
-          <w:kern w:val="0"/>
-          <w14:ligatures w14:val="none"/>
-        </w:rPr>
-        <w:pict w14:anchorId="7776CBB3">
-          <v:rect id="_x0000_i1031" alt="" style="width:468pt;height:.05pt;mso-width-percent:0;mso-height-percent:0;mso-width-percent:0;mso-height-percent:0" o:hralign="center" o:hrstd="t" o:hr="t" fillcolor="#a0a0a0" stroked="f"/>
+        </w:rPr>
+        <w:pict w14:anchorId="50339F3A">
+          <v:rect id="_x0000_i1039" alt="" style="width:468pt;height:.05pt;mso-width-percent:0;mso-height-percent:0;mso-width-percent:0;mso-height-percent:0" o:hralign="center" o:hrstd="t" o:hr="t" fillcolor="#a0a0a0" stroked="f"/>
         </w:pict>
       </w:r>
     </w:p>
@@ -5903,33 +4802,7 @@
           <w:szCs w:val="48"/>
           <w14:ligatures w14:val="none"/>
         </w:rPr>
-        <w:t>Phase 7 — Experiments First (</w:t>
-      </w:r>
-      <w:proofErr w:type="spellStart"/>
-      <w:r>
-        <w:rPr>
-          <w:rFonts w:ascii="Times New Roman" w:eastAsia="Times New Roman" w:hAnsi="Times New Roman" w:cs="Times New Roman"/>
-          <w:b/>
-          <w:bCs/>
-          <w:kern w:val="36"/>
-          <w:sz w:val="48"/>
-          <w:szCs w:val="48"/>
-          <w14:ligatures w14:val="none"/>
-        </w:rPr>
-        <w:t>Jupyter</w:t>
-      </w:r>
-      <w:proofErr w:type="spellEnd"/>
-      <w:r>
-        <w:rPr>
-          <w:rFonts w:ascii="Times New Roman" w:eastAsia="Times New Roman" w:hAnsi="Times New Roman" w:cs="Times New Roman"/>
-          <w:b/>
-          <w:bCs/>
-          <w:kern w:val="36"/>
-          <w:sz w:val="48"/>
-          <w:szCs w:val="48"/>
-          <w14:ligatures w14:val="none"/>
-        </w:rPr>
-        <w:t xml:space="preserve"> Notebooks) (Week 1–2)</w:t>
+        <w:t>Phase 7 — Experiments First (Jupyter Notebooks) (Week 1–2)</w:t>
       </w:r>
     </w:p>
     <w:p>
@@ -6033,42 +4906,8 @@
           <w:szCs w:val="20"/>
           <w14:ligatures w14:val="none"/>
         </w:rPr>
-        <w:t xml:space="preserve">poetry add --group dev </w:t>
-      </w:r>
-      <w:proofErr w:type="spellStart"/>
-      <w:r>
-        <w:rPr>
-          <w:rFonts w:ascii="Courier New" w:eastAsia="Times New Roman" w:hAnsi="Courier New" w:cs="Courier New"/>
-          <w:kern w:val="0"/>
-          <w:sz w:val="20"/>
-          <w:szCs w:val="20"/>
-          <w14:ligatures w14:val="none"/>
-        </w:rPr>
-        <w:t>jupyter</w:t>
-      </w:r>
-      <w:proofErr w:type="spellEnd"/>
-      <w:r>
-        <w:rPr>
-          <w:rFonts w:ascii="Courier New" w:eastAsia="Times New Roman" w:hAnsi="Courier New" w:cs="Courier New"/>
-          <w:kern w:val="0"/>
-          <w:sz w:val="20"/>
-          <w:szCs w:val="20"/>
-          <w14:ligatures w14:val="none"/>
-        </w:rPr>
-        <w:t xml:space="preserve"> </w:t>
-      </w:r>
-      <w:proofErr w:type="spellStart"/>
-      <w:r>
-        <w:rPr>
-          <w:rFonts w:ascii="Courier New" w:eastAsia="Times New Roman" w:hAnsi="Courier New" w:cs="Courier New"/>
-          <w:kern w:val="0"/>
-          <w:sz w:val="20"/>
-          <w:szCs w:val="20"/>
-          <w14:ligatures w14:val="none"/>
-        </w:rPr>
-        <w:t>ipykernel</w:t>
-      </w:r>
-      <w:proofErr w:type="spellEnd"/>
+        <w:t>poetry add --group dev jupyter ipykernel</w:t>
+      </w:r>
     </w:p>
     <w:p>
       <w:pPr>
@@ -6107,42 +4946,8 @@
           <w:szCs w:val="20"/>
           <w14:ligatures w14:val="none"/>
         </w:rPr>
-        <w:t xml:space="preserve">poetry run python -m </w:t>
-      </w:r>
-      <w:proofErr w:type="spellStart"/>
-      <w:r>
-        <w:rPr>
-          <w:rFonts w:ascii="Courier New" w:eastAsia="Times New Roman" w:hAnsi="Courier New" w:cs="Courier New"/>
-          <w:kern w:val="0"/>
-          <w:sz w:val="20"/>
-          <w:szCs w:val="20"/>
-          <w14:ligatures w14:val="none"/>
-        </w:rPr>
-        <w:t>ipykernel</w:t>
-      </w:r>
-      <w:proofErr w:type="spellEnd"/>
-      <w:r>
-        <w:rPr>
-          <w:rFonts w:ascii="Courier New" w:eastAsia="Times New Roman" w:hAnsi="Courier New" w:cs="Courier New"/>
-          <w:kern w:val="0"/>
-          <w:sz w:val="20"/>
-          <w:szCs w:val="20"/>
-          <w14:ligatures w14:val="none"/>
-        </w:rPr>
-        <w:t xml:space="preserve"> install --user --name </w:t>
-      </w:r>
-      <w:proofErr w:type="spellStart"/>
-      <w:r>
-        <w:rPr>
-          <w:rFonts w:ascii="Courier New" w:eastAsia="Times New Roman" w:hAnsi="Courier New" w:cs="Courier New"/>
-          <w:kern w:val="0"/>
-          <w:sz w:val="20"/>
-          <w:szCs w:val="20"/>
-          <w14:ligatures w14:val="none"/>
-        </w:rPr>
-        <w:t>careeros</w:t>
-      </w:r>
-      <w:proofErr w:type="spellEnd"/>
+        <w:t>poetry run python -m ipykernel install --user --name careeros</w:t>
+      </w:r>
     </w:p>
     <w:p>
       <w:pPr>
@@ -6612,18 +5417,9 @@
           <w:rFonts w:ascii="Times New Roman" w:eastAsia="Times New Roman" w:hAnsi="Times New Roman" w:cs="Times New Roman"/>
           <w:noProof/>
           <w:kern w:val="0"/>
-          <w14:ligatures w14:val="none"/>
-        </w:rPr>
-      </w:r>
-      <w:r>
-        <w:rPr>
-          <w:rFonts w:ascii="Times New Roman" w:eastAsia="Times New Roman" w:hAnsi="Times New Roman" w:cs="Times New Roman"/>
-          <w:noProof/>
-          <w:kern w:val="0"/>
-          <w14:ligatures w14:val="none"/>
-        </w:rPr>
-        <w:pict w14:anchorId="23718B0A">
-          <v:rect id="_x0000_i1032" alt="" style="width:468pt;height:.05pt;mso-width-percent:0;mso-height-percent:0;mso-width-percent:0;mso-height-percent:0" o:hralign="center" o:hrstd="t" o:hr="t" fillcolor="#a0a0a0" stroked="f"/>
+        </w:rPr>
+        <w:pict w14:anchorId="3BE03060">
+          <v:rect id="_x0000_i1038" alt="" style="width:468pt;height:.05pt;mso-width-percent:0;mso-height-percent:0;mso-width-percent:0;mso-height-percent:0" o:hralign="center" o:hrstd="t" o:hr="t" fillcolor="#a0a0a0" stroked="f"/>
         </w:pict>
       </w:r>
     </w:p>
@@ -6800,73 +5596,7 @@
           <w:szCs w:val="20"/>
           <w14:ligatures w14:val="none"/>
         </w:rPr>
-        <w:t xml:space="preserve">def </w:t>
-      </w:r>
-      <w:proofErr w:type="spellStart"/>
-      <w:r>
-        <w:rPr>
-          <w:rFonts w:ascii="Courier New" w:eastAsia="Times New Roman" w:hAnsi="Courier New" w:cs="Courier New"/>
-          <w:kern w:val="0"/>
-          <w:sz w:val="20"/>
-          <w:szCs w:val="20"/>
-          <w14:ligatures w14:val="none"/>
-        </w:rPr>
-        <w:t>chunk_</w:t>
-      </w:r>
-      <w:proofErr w:type="gramStart"/>
-      <w:r>
-        <w:rPr>
-          <w:rFonts w:ascii="Courier New" w:eastAsia="Times New Roman" w:hAnsi="Courier New" w:cs="Courier New"/>
-          <w:kern w:val="0"/>
-          <w:sz w:val="20"/>
-          <w:szCs w:val="20"/>
-          <w14:ligatures w14:val="none"/>
-        </w:rPr>
-        <w:t>text</w:t>
-      </w:r>
-      <w:proofErr w:type="spellEnd"/>
-      <w:r>
-        <w:rPr>
-          <w:rFonts w:ascii="Courier New" w:eastAsia="Times New Roman" w:hAnsi="Courier New" w:cs="Courier New"/>
-          <w:kern w:val="0"/>
-          <w:sz w:val="20"/>
-          <w:szCs w:val="20"/>
-          <w14:ligatures w14:val="none"/>
-        </w:rPr>
-        <w:t>(</w:t>
-      </w:r>
-      <w:proofErr w:type="gramEnd"/>
-      <w:r>
-        <w:rPr>
-          <w:rFonts w:ascii="Courier New" w:eastAsia="Times New Roman" w:hAnsi="Courier New" w:cs="Courier New"/>
-          <w:kern w:val="0"/>
-          <w:sz w:val="20"/>
-          <w:szCs w:val="20"/>
-          <w14:ligatures w14:val="none"/>
-        </w:rPr>
-        <w:t xml:space="preserve">text: str, </w:t>
-      </w:r>
-      <w:proofErr w:type="spellStart"/>
-      <w:r>
-        <w:rPr>
-          <w:rFonts w:ascii="Courier New" w:eastAsia="Times New Roman" w:hAnsi="Courier New" w:cs="Courier New"/>
-          <w:kern w:val="0"/>
-          <w:sz w:val="20"/>
-          <w:szCs w:val="20"/>
-          <w14:ligatures w14:val="none"/>
-        </w:rPr>
-        <w:t>chunk_size</w:t>
-      </w:r>
-      <w:proofErr w:type="spellEnd"/>
-      <w:r>
-        <w:rPr>
-          <w:rFonts w:ascii="Courier New" w:eastAsia="Times New Roman" w:hAnsi="Courier New" w:cs="Courier New"/>
-          <w:kern w:val="0"/>
-          <w:sz w:val="20"/>
-          <w:szCs w:val="20"/>
-          <w14:ligatures w14:val="none"/>
-        </w:rPr>
-        <w:t>: int = 900, overlap: int = 120) -&gt; list[str]:</w:t>
+        <w:t>def chunk_text(text: str, chunk_size: int = 900, overlap: int = 120) -&gt; list[str]:</w:t>
       </w:r>
     </w:p>
     <w:p>
@@ -6976,29 +5706,7 @@
           <w:szCs w:val="20"/>
           <w14:ligatures w14:val="none"/>
         </w:rPr>
-        <w:t xml:space="preserve">    </w:t>
-      </w:r>
-      <w:proofErr w:type="spellStart"/>
-      <w:r>
-        <w:rPr>
-          <w:rFonts w:ascii="Courier New" w:eastAsia="Times New Roman" w:hAnsi="Courier New" w:cs="Courier New"/>
-          <w:kern w:val="0"/>
-          <w:sz w:val="20"/>
-          <w:szCs w:val="20"/>
-          <w14:ligatures w14:val="none"/>
-        </w:rPr>
-        <w:t>Args</w:t>
-      </w:r>
-      <w:proofErr w:type="spellEnd"/>
-      <w:r>
-        <w:rPr>
-          <w:rFonts w:ascii="Courier New" w:eastAsia="Times New Roman" w:hAnsi="Courier New" w:cs="Courier New"/>
-          <w:kern w:val="0"/>
-          <w:sz w:val="20"/>
-          <w:szCs w:val="20"/>
-          <w14:ligatures w14:val="none"/>
-        </w:rPr>
-        <w:t>:</w:t>
+        <w:t xml:space="preserve">    Args:</w:t>
       </w:r>
     </w:p>
     <w:p>
@@ -7078,29 +5786,7 @@
           <w:szCs w:val="20"/>
           <w14:ligatures w14:val="none"/>
         </w:rPr>
-        <w:t xml:space="preserve">        </w:t>
-      </w:r>
-      <w:proofErr w:type="spellStart"/>
-      <w:r>
-        <w:rPr>
-          <w:rFonts w:ascii="Courier New" w:eastAsia="Times New Roman" w:hAnsi="Courier New" w:cs="Courier New"/>
-          <w:kern w:val="0"/>
-          <w:sz w:val="20"/>
-          <w:szCs w:val="20"/>
-          <w14:ligatures w14:val="none"/>
-        </w:rPr>
-        <w:t>chunk_size</w:t>
-      </w:r>
-      <w:proofErr w:type="spellEnd"/>
-      <w:r>
-        <w:rPr>
-          <w:rFonts w:ascii="Courier New" w:eastAsia="Times New Roman" w:hAnsi="Courier New" w:cs="Courier New"/>
-          <w:kern w:val="0"/>
-          <w:sz w:val="20"/>
-          <w:szCs w:val="20"/>
-          <w14:ligatures w14:val="none"/>
-        </w:rPr>
-        <w:t>: Approx character length per chunk.</w:t>
+        <w:t xml:space="preserve">        chunk_size: Approx character length per chunk.</w:t>
       </w:r>
     </w:p>
     <w:p>
@@ -7369,18 +6055,9 @@
           <w:rFonts w:ascii="Times New Roman" w:eastAsia="Times New Roman" w:hAnsi="Times New Roman" w:cs="Times New Roman"/>
           <w:noProof/>
           <w:kern w:val="0"/>
-          <w14:ligatures w14:val="none"/>
-        </w:rPr>
-      </w:r>
-      <w:r>
-        <w:rPr>
-          <w:rFonts w:ascii="Times New Roman" w:eastAsia="Times New Roman" w:hAnsi="Times New Roman" w:cs="Times New Roman"/>
-          <w:noProof/>
-          <w:kern w:val="0"/>
-          <w14:ligatures w14:val="none"/>
-        </w:rPr>
-        <w:pict w14:anchorId="55EFBF98">
-          <v:rect id="_x0000_i1033" alt="" style="width:468pt;height:.05pt;mso-width-percent:0;mso-height-percent:0;mso-width-percent:0;mso-height-percent:0" o:hralign="center" o:hrstd="t" o:hr="t" fillcolor="#a0a0a0" stroked="f"/>
+        </w:rPr>
+        <w:pict w14:anchorId="36015675">
+          <v:rect id="_x0000_i1037" alt="" style="width:468pt;height:.05pt;mso-width-percent:0;mso-height-percent:0;mso-width-percent:0;mso-height-percent:0" o:hralign="center" o:hrstd="t" o:hr="t" fillcolor="#a0a0a0" stroked="f"/>
         </w:pict>
       </w:r>
     </w:p>
@@ -7529,27 +6206,15 @@
           <w14:ligatures w14:val="none"/>
         </w:rPr>
       </w:pPr>
-      <w:proofErr w:type="spellStart"/>
-      <w:r>
-        <w:rPr>
-          <w:rFonts w:ascii="Courier New" w:eastAsia="Times New Roman" w:hAnsi="Courier New" w:cs="Courier New"/>
-          <w:kern w:val="0"/>
-          <w:sz w:val="20"/>
-          <w:szCs w:val="20"/>
-          <w14:ligatures w14:val="none"/>
-        </w:rPr>
-        <w:t>ollama</w:t>
-      </w:r>
-      <w:proofErr w:type="spellEnd"/>
-      <w:r>
-        <w:rPr>
-          <w:rFonts w:ascii="Courier New" w:eastAsia="Times New Roman" w:hAnsi="Courier New" w:cs="Courier New"/>
-          <w:kern w:val="0"/>
-          <w:sz w:val="20"/>
-          <w:szCs w:val="20"/>
-          <w14:ligatures w14:val="none"/>
-        </w:rPr>
-        <w:t xml:space="preserve"> pull mistral</w:t>
+      <w:r>
+        <w:rPr>
+          <w:rFonts w:ascii="Courier New" w:eastAsia="Times New Roman" w:hAnsi="Courier New" w:cs="Courier New"/>
+          <w:kern w:val="0"/>
+          <w:sz w:val="20"/>
+          <w:szCs w:val="20"/>
+          <w14:ligatures w14:val="none"/>
+        </w:rPr>
+        <w:t>ollama pull mistral</w:t>
       </w:r>
     </w:p>
     <w:p>
@@ -7647,40 +6312,16 @@
           <w14:ligatures w14:val="none"/>
         </w:rPr>
       </w:pPr>
-      <w:proofErr w:type="spellStart"/>
-      <w:r>
-        <w:rPr>
-          <w:rFonts w:ascii="Courier New" w:eastAsia="Times New Roman" w:hAnsi="Courier New" w:cs="Courier New"/>
-          <w:kern w:val="0"/>
-          <w:sz w:val="20"/>
-          <w:szCs w:val="20"/>
-          <w14:ligatures w14:val="none"/>
-        </w:rPr>
-        <w:t>json_generate</w:t>
-      </w:r>
-      <w:proofErr w:type="spellEnd"/>
-      <w:r>
-        <w:rPr>
-          <w:rFonts w:ascii="Courier New" w:eastAsia="Times New Roman" w:hAnsi="Courier New" w:cs="Courier New"/>
-          <w:kern w:val="0"/>
-          <w:sz w:val="20"/>
-          <w:szCs w:val="20"/>
-          <w14:ligatures w14:val="none"/>
-        </w:rPr>
-        <w:t>(schema)-&gt;</w:t>
-      </w:r>
-      <w:proofErr w:type="spellStart"/>
-      <w:r>
-        <w:rPr>
-          <w:rFonts w:ascii="Courier New" w:eastAsia="Times New Roman" w:hAnsi="Courier New" w:cs="Courier New"/>
-          <w:kern w:val="0"/>
-          <w:sz w:val="20"/>
-          <w:szCs w:val="20"/>
-          <w14:ligatures w14:val="none"/>
-        </w:rPr>
-        <w:t>dict</w:t>
-      </w:r>
-      <w:proofErr w:type="spellEnd"/>
+      <w:r>
+        <w:rPr>
+          <w:rFonts w:ascii="Courier New" w:eastAsia="Times New Roman" w:hAnsi="Courier New" w:cs="Courier New"/>
+          <w:kern w:val="0"/>
+          <w:sz w:val="20"/>
+          <w:szCs w:val="20"/>
+          <w14:ligatures w14:val="none"/>
+        </w:rPr>
+        <w:t>json_generate(schema)-&gt;dict</w:t>
+      </w:r>
     </w:p>
     <w:p>
       <w:pPr>
@@ -7778,43 +6419,7 @@
           <w:kern w:val="0"/>
           <w14:ligatures w14:val="none"/>
         </w:rPr>
-        <w:t xml:space="preserve">OpenAI / Azure / </w:t>
-      </w:r>
-      <w:proofErr w:type="spellStart"/>
-      <w:r>
-        <w:rPr>
-          <w:rFonts w:ascii="Times New Roman" w:eastAsia="Times New Roman" w:hAnsi="Times New Roman" w:cs="Times New Roman"/>
-          <w:kern w:val="0"/>
-          <w14:ligatures w14:val="none"/>
-        </w:rPr>
-        <w:t>Groq</w:t>
-      </w:r>
-      <w:proofErr w:type="spellEnd"/>
-      <w:r>
-        <w:rPr>
-          <w:rFonts w:ascii="Times New Roman" w:eastAsia="Times New Roman" w:hAnsi="Times New Roman" w:cs="Times New Roman"/>
-          <w:kern w:val="0"/>
-          <w14:ligatures w14:val="none"/>
-        </w:rPr>
-        <w:t xml:space="preserve"> (</w:t>
-      </w:r>
-      <w:proofErr w:type="gramStart"/>
-      <w:r>
-        <w:rPr>
-          <w:rFonts w:ascii="Times New Roman" w:eastAsia="Times New Roman" w:hAnsi="Times New Roman" w:cs="Times New Roman"/>
-          <w:kern w:val="0"/>
-          <w14:ligatures w14:val="none"/>
-        </w:rPr>
-        <w:t>free-tier</w:t>
-      </w:r>
-      <w:proofErr w:type="gramEnd"/>
-      <w:r>
-        <w:rPr>
-          <w:rFonts w:ascii="Times New Roman" w:eastAsia="Times New Roman" w:hAnsi="Times New Roman" w:cs="Times New Roman"/>
-          <w:kern w:val="0"/>
-          <w14:ligatures w14:val="none"/>
-        </w:rPr>
-        <w:t xml:space="preserve"> sometimes)</w:t>
+        <w:t>OpenAI / Azure / Groq (free-tier sometimes)</w:t>
       </w:r>
     </w:p>
     <w:p>
@@ -7836,16 +6441,7 @@
           <w:kern w:val="0"/>
           <w14:ligatures w14:val="none"/>
         </w:rPr>
-        <w:t xml:space="preserve">keep provider switch </w:t>
-      </w:r>
-      <w:proofErr w:type="gramStart"/>
-      <w:r>
-        <w:rPr>
-          <w:rFonts w:ascii="Times New Roman" w:eastAsia="Times New Roman" w:hAnsi="Times New Roman" w:cs="Times New Roman"/>
-          <w:kern w:val="0"/>
-          <w14:ligatures w14:val="none"/>
-        </w:rPr>
-        <w:t xml:space="preserve">in </w:t>
+        <w:t xml:space="preserve">keep provider switch in </w:t>
       </w:r>
       <w:r>
         <w:rPr>
@@ -7857,7 +6453,6 @@
         </w:rPr>
         <w:t>.env</w:t>
       </w:r>
-      <w:proofErr w:type="gramEnd"/>
     </w:p>
     <w:p>
       <w:pPr>
@@ -7873,18 +6468,9 @@
           <w:rFonts w:ascii="Times New Roman" w:eastAsia="Times New Roman" w:hAnsi="Times New Roman" w:cs="Times New Roman"/>
           <w:noProof/>
           <w:kern w:val="0"/>
-          <w14:ligatures w14:val="none"/>
-        </w:rPr>
-      </w:r>
-      <w:r>
-        <w:rPr>
-          <w:rFonts w:ascii="Times New Roman" w:eastAsia="Times New Roman" w:hAnsi="Times New Roman" w:cs="Times New Roman"/>
-          <w:noProof/>
-          <w:kern w:val="0"/>
-          <w14:ligatures w14:val="none"/>
-        </w:rPr>
-        <w:pict w14:anchorId="69961690">
-          <v:rect id="_x0000_i1034" alt="" style="width:468pt;height:.05pt;mso-width-percent:0;mso-height-percent:0;mso-width-percent:0;mso-height-percent:0" o:hralign="center" o:hrstd="t" o:hr="t" fillcolor="#a0a0a0" stroked="f"/>
+        </w:rPr>
+        <w:pict w14:anchorId="4236B0F4">
+          <v:rect id="_x0000_i1036" alt="" style="width:468pt;height:.05pt;mso-width-percent:0;mso-height-percent:0;mso-width-percent:0;mso-height-percent:0" o:hralign="center" o:hrstd="t" o:hr="t" fillcolor="#a0a0a0" stroked="f"/>
         </w:pict>
       </w:r>
     </w:p>
@@ -7991,7 +6577,6 @@
           <w14:ligatures w14:val="none"/>
         </w:rPr>
       </w:pPr>
-      <w:proofErr w:type="spellStart"/>
       <w:r>
         <w:rPr>
           <w:rFonts w:ascii="Courier New" w:eastAsia="Times New Roman" w:hAnsi="Courier New" w:cs="Courier New"/>
@@ -8002,7 +6587,6 @@
         </w:rPr>
         <w:t>AgentInput</w:t>
       </w:r>
-      <w:proofErr w:type="spellEnd"/>
     </w:p>
     <w:p>
       <w:pPr>
@@ -8017,7 +6601,6 @@
           <w14:ligatures w14:val="none"/>
         </w:rPr>
       </w:pPr>
-      <w:proofErr w:type="spellStart"/>
       <w:r>
         <w:rPr>
           <w:rFonts w:ascii="Courier New" w:eastAsia="Times New Roman" w:hAnsi="Courier New" w:cs="Courier New"/>
@@ -8028,7 +6611,6 @@
         </w:rPr>
         <w:t>AgentOutput</w:t>
       </w:r>
-      <w:proofErr w:type="spellEnd"/>
       <w:r>
         <w:rPr>
           <w:rFonts w:ascii="Times New Roman" w:eastAsia="Times New Roman" w:hAnsi="Times New Roman" w:cs="Times New Roman"/>
@@ -8155,27 +6737,15 @@
           <w14:ligatures w14:val="none"/>
         </w:rPr>
       </w:pPr>
-      <w:proofErr w:type="spellStart"/>
-      <w:r>
-        <w:rPr>
-          <w:rFonts w:ascii="Courier New" w:eastAsia="Times New Roman" w:hAnsi="Courier New" w:cs="Courier New"/>
-          <w:kern w:val="0"/>
-          <w:sz w:val="20"/>
-          <w:szCs w:val="20"/>
-          <w14:ligatures w14:val="none"/>
-        </w:rPr>
-        <w:t>needs_human_approval</w:t>
-      </w:r>
-      <w:proofErr w:type="spellEnd"/>
-      <w:r>
-        <w:rPr>
-          <w:rFonts w:ascii="Courier New" w:eastAsia="Times New Roman" w:hAnsi="Courier New" w:cs="Courier New"/>
-          <w:kern w:val="0"/>
-          <w:sz w:val="20"/>
-          <w:szCs w:val="20"/>
-          <w14:ligatures w14:val="none"/>
-        </w:rPr>
-        <w:t>: bool</w:t>
+      <w:r>
+        <w:rPr>
+          <w:rFonts w:ascii="Courier New" w:eastAsia="Times New Roman" w:hAnsi="Courier New" w:cs="Courier New"/>
+          <w:kern w:val="0"/>
+          <w:sz w:val="20"/>
+          <w:szCs w:val="20"/>
+          <w14:ligatures w14:val="none"/>
+        </w:rPr>
+        <w:t>needs_human_approval: bool</w:t>
       </w:r>
     </w:p>
     <w:p>
@@ -8409,17 +6979,8 @@
           <w:rFonts w:ascii="Times New Roman" w:eastAsia="Times New Roman" w:hAnsi="Times New Roman" w:cs="Times New Roman"/>
           <w:noProof/>
           <w:kern w:val="0"/>
-          <w14:ligatures w14:val="none"/>
-        </w:rPr>
-      </w:r>
-      <w:r>
-        <w:rPr>
-          <w:rFonts w:ascii="Times New Roman" w:eastAsia="Times New Roman" w:hAnsi="Times New Roman" w:cs="Times New Roman"/>
-          <w:noProof/>
-          <w:kern w:val="0"/>
-          <w14:ligatures w14:val="none"/>
-        </w:rPr>
-        <w:pict w14:anchorId="3DEC852E">
+        </w:rPr>
+        <w:pict w14:anchorId="2197D99D">
           <v:rect id="_x0000_i1035" alt="" style="width:468pt;height:.05pt;mso-width-percent:0;mso-height-percent:0;mso-width-percent:0;mso-height-percent:0" o:hralign="center" o:hrstd="t" o:hr="t" fillcolor="#a0a0a0" stroked="f"/>
         </w:pict>
       </w:r>
@@ -8879,18 +7440,9 @@
           <w:rFonts w:ascii="Times New Roman" w:eastAsia="Times New Roman" w:hAnsi="Times New Roman" w:cs="Times New Roman"/>
           <w:noProof/>
           <w:kern w:val="0"/>
-          <w14:ligatures w14:val="none"/>
-        </w:rPr>
-      </w:r>
-      <w:r>
-        <w:rPr>
-          <w:rFonts w:ascii="Times New Roman" w:eastAsia="Times New Roman" w:hAnsi="Times New Roman" w:cs="Times New Roman"/>
-          <w:noProof/>
-          <w:kern w:val="0"/>
-          <w14:ligatures w14:val="none"/>
-        </w:rPr>
-        <w:pict w14:anchorId="35BDFAA5">
-          <v:rect id="_x0000_i1036" alt="" style="width:468pt;height:.05pt;mso-width-percent:0;mso-height-percent:0;mso-width-percent:0;mso-height-percent:0" o:hralign="center" o:hrstd="t" o:hr="t" fillcolor="#a0a0a0" stroked="f"/>
+        </w:rPr>
+        <w:pict w14:anchorId="493A355A">
+          <v:rect id="_x0000_i1034" alt="" style="width:468pt;height:.05pt;mso-width-percent:0;mso-height-percent:0;mso-width-percent:0;mso-height-percent:0" o:hralign="center" o:hrstd="t" o:hr="t" fillcolor="#a0a0a0" stroked="f"/>
         </w:pict>
       </w:r>
     </w:p>
@@ -9132,18 +7684,9 @@
           <w:rFonts w:ascii="Times New Roman" w:eastAsia="Times New Roman" w:hAnsi="Times New Roman" w:cs="Times New Roman"/>
           <w:noProof/>
           <w:kern w:val="0"/>
-          <w14:ligatures w14:val="none"/>
-        </w:rPr>
-      </w:r>
-      <w:r>
-        <w:rPr>
-          <w:rFonts w:ascii="Times New Roman" w:eastAsia="Times New Roman" w:hAnsi="Times New Roman" w:cs="Times New Roman"/>
-          <w:noProof/>
-          <w:kern w:val="0"/>
-          <w14:ligatures w14:val="none"/>
-        </w:rPr>
-        <w:pict w14:anchorId="544569FA">
-          <v:rect id="_x0000_i1037" alt="" style="width:468pt;height:.05pt;mso-width-percent:0;mso-height-percent:0;mso-width-percent:0;mso-height-percent:0" o:hralign="center" o:hrstd="t" o:hr="t" fillcolor="#a0a0a0" stroked="f"/>
+        </w:rPr>
+        <w:pict w14:anchorId="580AC3F5">
+          <v:rect id="_x0000_i1033" alt="" style="width:468pt;height:.05pt;mso-width-percent:0;mso-height-percent:0;mso-width-percent:0;mso-height-percent:0" o:hralign="center" o:hrstd="t" o:hr="t" fillcolor="#a0a0a0" stroked="f"/>
         </w:pict>
       </w:r>
     </w:p>
@@ -9171,33 +7714,7 @@
           <w:szCs w:val="48"/>
           <w14:ligatures w14:val="none"/>
         </w:rPr>
-        <w:t>Phase 13 — Frontend (</w:t>
-      </w:r>
-      <w:proofErr w:type="spellStart"/>
-      <w:r>
-        <w:rPr>
-          <w:rFonts w:ascii="Times New Roman" w:eastAsia="Times New Roman" w:hAnsi="Times New Roman" w:cs="Times New Roman"/>
-          <w:b/>
-          <w:bCs/>
-          <w:kern w:val="36"/>
-          <w:sz w:val="48"/>
-          <w:szCs w:val="48"/>
-          <w14:ligatures w14:val="none"/>
-        </w:rPr>
-        <w:t>Streamlit</w:t>
-      </w:r>
-      <w:proofErr w:type="spellEnd"/>
-      <w:r>
-        <w:rPr>
-          <w:rFonts w:ascii="Times New Roman" w:eastAsia="Times New Roman" w:hAnsi="Times New Roman" w:cs="Times New Roman"/>
-          <w:b/>
-          <w:bCs/>
-          <w:kern w:val="36"/>
-          <w:sz w:val="48"/>
-          <w:szCs w:val="48"/>
-          <w14:ligatures w14:val="none"/>
-        </w:rPr>
-        <w:t>) (Week 4–5)</w:t>
+        <w:t>Phase 13 — Frontend (Streamlit) (Week 4–5)</w:t>
       </w:r>
     </w:p>
     <w:p>
@@ -9411,29 +7928,7 @@
           <w:szCs w:val="20"/>
           <w14:ligatures w14:val="none"/>
         </w:rPr>
-        <w:t xml:space="preserve">poetry run </w:t>
-      </w:r>
-      <w:proofErr w:type="spellStart"/>
-      <w:r>
-        <w:rPr>
-          <w:rFonts w:ascii="Courier New" w:eastAsia="Times New Roman" w:hAnsi="Courier New" w:cs="Courier New"/>
-          <w:kern w:val="0"/>
-          <w:sz w:val="20"/>
-          <w:szCs w:val="20"/>
-          <w14:ligatures w14:val="none"/>
-        </w:rPr>
-        <w:t>streamlit</w:t>
-      </w:r>
-      <w:proofErr w:type="spellEnd"/>
-      <w:r>
-        <w:rPr>
-          <w:rFonts w:ascii="Courier New" w:eastAsia="Times New Roman" w:hAnsi="Courier New" w:cs="Courier New"/>
-          <w:kern w:val="0"/>
-          <w:sz w:val="20"/>
-          <w:szCs w:val="20"/>
-          <w14:ligatures w14:val="none"/>
-        </w:rPr>
-        <w:t xml:space="preserve"> run frontend/streamlit_app.py</w:t>
+        <w:t>poetry run streamlit run frontend/streamlit_app.py</w:t>
       </w:r>
     </w:p>
     <w:p>
@@ -9450,18 +7945,9 @@
           <w:rFonts w:ascii="Times New Roman" w:eastAsia="Times New Roman" w:hAnsi="Times New Roman" w:cs="Times New Roman"/>
           <w:noProof/>
           <w:kern w:val="0"/>
-          <w14:ligatures w14:val="none"/>
-        </w:rPr>
-      </w:r>
-      <w:r>
-        <w:rPr>
-          <w:rFonts w:ascii="Times New Roman" w:eastAsia="Times New Roman" w:hAnsi="Times New Roman" w:cs="Times New Roman"/>
-          <w:noProof/>
-          <w:kern w:val="0"/>
-          <w14:ligatures w14:val="none"/>
-        </w:rPr>
-        <w:pict w14:anchorId="05FF7417">
-          <v:rect id="_x0000_i1038" alt="" style="width:468pt;height:.05pt;mso-width-percent:0;mso-height-percent:0;mso-width-percent:0;mso-height-percent:0" o:hralign="center" o:hrstd="t" o:hr="t" fillcolor="#a0a0a0" stroked="f"/>
+        </w:rPr>
+        <w:pict w14:anchorId="3F01A8C5">
+          <v:rect id="_x0000_i1032" alt="" style="width:468pt;height:.05pt;mso-width-percent:0;mso-height-percent:0;mso-width-percent:0;mso-height-percent:0" o:hralign="center" o:hrstd="t" o:hr="t" fillcolor="#a0a0a0" stroked="f"/>
         </w:pict>
       </w:r>
     </w:p>
@@ -9517,42 +8003,8 @@
           <w:szCs w:val="20"/>
           <w14:ligatures w14:val="none"/>
         </w:rPr>
-        <w:t>.</w:t>
-      </w:r>
-      <w:proofErr w:type="spellStart"/>
-      <w:r>
-        <w:rPr>
-          <w:rFonts w:ascii="Courier New" w:eastAsia="Times New Roman" w:hAnsi="Courier New" w:cs="Courier New"/>
-          <w:kern w:val="0"/>
-          <w:sz w:val="20"/>
-          <w:szCs w:val="20"/>
-          <w14:ligatures w14:val="none"/>
-        </w:rPr>
-        <w:t>github</w:t>
-      </w:r>
-      <w:proofErr w:type="spellEnd"/>
-      <w:r>
-        <w:rPr>
-          <w:rFonts w:ascii="Courier New" w:eastAsia="Times New Roman" w:hAnsi="Courier New" w:cs="Courier New"/>
-          <w:kern w:val="0"/>
-          <w:sz w:val="20"/>
-          <w:szCs w:val="20"/>
-          <w14:ligatures w14:val="none"/>
-        </w:rPr>
-        <w:t>/workflows/</w:t>
-      </w:r>
-      <w:proofErr w:type="spellStart"/>
-      <w:r>
-        <w:rPr>
-          <w:rFonts w:ascii="Courier New" w:eastAsia="Times New Roman" w:hAnsi="Courier New" w:cs="Courier New"/>
-          <w:kern w:val="0"/>
-          <w:sz w:val="20"/>
-          <w:szCs w:val="20"/>
-          <w14:ligatures w14:val="none"/>
-        </w:rPr>
-        <w:t>ci.yml</w:t>
-      </w:r>
-      <w:proofErr w:type="spellEnd"/>
+        <w:t>.github/workflows/ci.yml</w:t>
+      </w:r>
       <w:r>
         <w:rPr>
           <w:rFonts w:ascii="Times New Roman" w:eastAsia="Times New Roman" w:hAnsi="Times New Roman" w:cs="Times New Roman"/>
@@ -9669,18 +8121,8 @@
           <w:kern w:val="0"/>
           <w14:ligatures w14:val="none"/>
         </w:rPr>
-        <w:t xml:space="preserve">run </w:t>
-      </w:r>
-      <w:proofErr w:type="spellStart"/>
-      <w:r>
-        <w:rPr>
-          <w:rFonts w:ascii="Times New Roman" w:eastAsia="Times New Roman" w:hAnsi="Times New Roman" w:cs="Times New Roman"/>
-          <w:kern w:val="0"/>
-          <w14:ligatures w14:val="none"/>
-        </w:rPr>
-        <w:t>pytest</w:t>
-      </w:r>
-      <w:proofErr w:type="spellEnd"/>
+        <w:t>run pytest</w:t>
+      </w:r>
     </w:p>
     <w:p>
       <w:pPr>
@@ -9714,18 +8156,9 @@
           <w:rFonts w:ascii="Times New Roman" w:eastAsia="Times New Roman" w:hAnsi="Times New Roman" w:cs="Times New Roman"/>
           <w:noProof/>
           <w:kern w:val="0"/>
-          <w14:ligatures w14:val="none"/>
-        </w:rPr>
-      </w:r>
-      <w:r>
-        <w:rPr>
-          <w:rFonts w:ascii="Times New Roman" w:eastAsia="Times New Roman" w:hAnsi="Times New Roman" w:cs="Times New Roman"/>
-          <w:noProof/>
-          <w:kern w:val="0"/>
-          <w14:ligatures w14:val="none"/>
-        </w:rPr>
-        <w:pict w14:anchorId="341548C9">
-          <v:rect id="_x0000_i1039" alt="" style="width:468pt;height:.05pt;mso-width-percent:0;mso-height-percent:0;mso-width-percent:0;mso-height-percent:0" o:hralign="center" o:hrstd="t" o:hr="t" fillcolor="#a0a0a0" stroked="f"/>
+        </w:rPr>
+        <w:pict w14:anchorId="55984638">
+          <v:rect id="_x0000_i1031" alt="" style="width:468pt;height:.05pt;mso-width-percent:0;mso-height-percent:0;mso-width-percent:0;mso-height-percent:0" o:hralign="center" o:hrstd="t" o:hr="t" fillcolor="#a0a0a0" stroked="f"/>
         </w:pict>
       </w:r>
     </w:p>
@@ -9788,7 +8221,6 @@
           <w14:ligatures w14:val="none"/>
         </w:rPr>
       </w:pPr>
-      <w:proofErr w:type="spellStart"/>
       <w:r>
         <w:rPr>
           <w:rFonts w:ascii="Courier New" w:eastAsia="Times New Roman" w:hAnsi="Courier New" w:cs="Courier New"/>
@@ -9799,7 +8231,6 @@
         </w:rPr>
         <w:t>Dockerfile</w:t>
       </w:r>
-      <w:proofErr w:type="spellEnd"/>
       <w:r>
         <w:rPr>
           <w:rFonts w:ascii="Times New Roman" w:eastAsia="Times New Roman" w:hAnsi="Times New Roman" w:cs="Times New Roman"/>
@@ -9830,20 +8261,8 @@
           <w:szCs w:val="20"/>
           <w14:ligatures w14:val="none"/>
         </w:rPr>
-        <w:t>docker-</w:t>
-      </w:r>
-      <w:proofErr w:type="spellStart"/>
-      <w:r>
-        <w:rPr>
-          <w:rFonts w:ascii="Courier New" w:eastAsia="Times New Roman" w:hAnsi="Courier New" w:cs="Courier New"/>
-          <w:kern w:val="0"/>
-          <w:sz w:val="20"/>
-          <w:szCs w:val="20"/>
-          <w14:ligatures w14:val="none"/>
-        </w:rPr>
-        <w:t>compose.yml</w:t>
-      </w:r>
-      <w:proofErr w:type="spellEnd"/>
+        <w:t>docker-compose.yml</w:t>
+      </w:r>
       <w:r>
         <w:rPr>
           <w:rFonts w:ascii="Times New Roman" w:eastAsia="Times New Roman" w:hAnsi="Times New Roman" w:cs="Times New Roman"/>
@@ -9925,18 +8344,9 @@
           <w:rFonts w:ascii="Times New Roman" w:eastAsia="Times New Roman" w:hAnsi="Times New Roman" w:cs="Times New Roman"/>
           <w:noProof/>
           <w:kern w:val="0"/>
-          <w14:ligatures w14:val="none"/>
-        </w:rPr>
-      </w:r>
-      <w:r>
-        <w:rPr>
-          <w:rFonts w:ascii="Times New Roman" w:eastAsia="Times New Roman" w:hAnsi="Times New Roman" w:cs="Times New Roman"/>
-          <w:noProof/>
-          <w:kern w:val="0"/>
-          <w14:ligatures w14:val="none"/>
-        </w:rPr>
-        <w:pict w14:anchorId="2F9603DD">
-          <v:rect id="_x0000_i1040" alt="" style="width:468pt;height:.05pt;mso-width-percent:0;mso-height-percent:0;mso-width-percent:0;mso-height-percent:0" o:hralign="center" o:hrstd="t" o:hr="t" fillcolor="#a0a0a0" stroked="f"/>
+        </w:rPr>
+        <w:pict w14:anchorId="6415EEC2">
+          <v:rect id="_x0000_i1030" alt="" style="width:468pt;height:.05pt;mso-width-percent:0;mso-height-percent:0;mso-width-percent:0;mso-height-percent:0" o:hralign="center" o:hrstd="t" o:hr="t" fillcolor="#a0a0a0" stroked="f"/>
         </w:pict>
       </w:r>
     </w:p>
@@ -10070,25 +8480,7 @@
           <w:kern w:val="0"/>
           <w14:ligatures w14:val="none"/>
         </w:rPr>
-        <w:t xml:space="preserve"> for </w:t>
-      </w:r>
-      <w:proofErr w:type="spellStart"/>
-      <w:r>
-        <w:rPr>
-          <w:rFonts w:ascii="Times New Roman" w:eastAsia="Times New Roman" w:hAnsi="Times New Roman" w:cs="Times New Roman"/>
-          <w:kern w:val="0"/>
-          <w14:ligatures w14:val="none"/>
-        </w:rPr>
-        <w:t>Streamlit</w:t>
-      </w:r>
-      <w:proofErr w:type="spellEnd"/>
-      <w:r>
-        <w:rPr>
-          <w:rFonts w:ascii="Times New Roman" w:eastAsia="Times New Roman" w:hAnsi="Times New Roman" w:cs="Times New Roman"/>
-          <w:kern w:val="0"/>
-          <w14:ligatures w14:val="none"/>
-        </w:rPr>
-        <w:t xml:space="preserve"> UI (backend separate)</w:t>
+        <w:t xml:space="preserve"> for Streamlit UI (backend separate)</w:t>
       </w:r>
     </w:p>
     <w:p>
@@ -10199,18 +8591,9 @@
           <w:rFonts w:ascii="Times New Roman" w:eastAsia="Times New Roman" w:hAnsi="Times New Roman" w:cs="Times New Roman"/>
           <w:noProof/>
           <w:kern w:val="0"/>
-          <w14:ligatures w14:val="none"/>
-        </w:rPr>
-      </w:r>
-      <w:r>
-        <w:rPr>
-          <w:rFonts w:ascii="Times New Roman" w:eastAsia="Times New Roman" w:hAnsi="Times New Roman" w:cs="Times New Roman"/>
-          <w:noProof/>
-          <w:kern w:val="0"/>
-          <w14:ligatures w14:val="none"/>
-        </w:rPr>
-        <w:pict w14:anchorId="291EFBA5">
-          <v:rect id="_x0000_i1041" alt="" style="width:468pt;height:.05pt;mso-width-percent:0;mso-height-percent:0;mso-width-percent:0;mso-height-percent:0" o:hralign="center" o:hrstd="t" o:hr="t" fillcolor="#a0a0a0" stroked="f"/>
+        </w:rPr>
+        <w:pict w14:anchorId="5DB3D610">
+          <v:rect id="_x0000_i1029" alt="" style="width:468pt;height:.05pt;mso-width-percent:0;mso-height-percent:0;mso-width-percent:0;mso-height-percent:0" o:hralign="center" o:hrstd="t" o:hr="t" fillcolor="#a0a0a0" stroked="f"/>
         </w:pict>
       </w:r>
     </w:p>
@@ -10272,7 +8655,6 @@
           <w14:ligatures w14:val="none"/>
         </w:rPr>
       </w:pPr>
-      <w:proofErr w:type="gramStart"/>
       <w:r>
         <w:rPr>
           <w:rFonts w:ascii="Courier New" w:eastAsia="Times New Roman" w:hAnsi="Courier New" w:cs="Courier New"/>
@@ -10283,7 +8665,6 @@
         </w:rPr>
         <w:t>.env</w:t>
       </w:r>
-      <w:proofErr w:type="gramEnd"/>
       <w:r>
         <w:rPr>
           <w:rFonts w:ascii="Times New Roman" w:eastAsia="Times New Roman" w:hAnsi="Times New Roman" w:cs="Times New Roman"/>
@@ -10435,18 +8816,9 @@
           <w:rFonts w:ascii="Times New Roman" w:eastAsia="Times New Roman" w:hAnsi="Times New Roman" w:cs="Times New Roman"/>
           <w:noProof/>
           <w:kern w:val="0"/>
-          <w14:ligatures w14:val="none"/>
-        </w:rPr>
-      </w:r>
-      <w:r>
-        <w:rPr>
-          <w:rFonts w:ascii="Times New Roman" w:eastAsia="Times New Roman" w:hAnsi="Times New Roman" w:cs="Times New Roman"/>
-          <w:noProof/>
-          <w:kern w:val="0"/>
-          <w14:ligatures w14:val="none"/>
-        </w:rPr>
-        <w:pict w14:anchorId="24A8B1EC">
-          <v:rect id="_x0000_i1042" alt="" style="width:468pt;height:.05pt;mso-width-percent:0;mso-height-percent:0;mso-width-percent:0;mso-height-percent:0" o:hralign="center" o:hrstd="t" o:hr="t" fillcolor="#a0a0a0" stroked="f"/>
+        </w:rPr>
+        <w:pict w14:anchorId="02742A7E">
+          <v:rect id="_x0000_i1028" alt="" style="width:468pt;height:.05pt;mso-width-percent:0;mso-height-percent:0;mso-width-percent:0;mso-height-percent:0" o:hralign="center" o:hrstd="t" o:hr="t" fillcolor="#a0a0a0" stroked="f"/>
         </w:pict>
       </w:r>
     </w:p>
@@ -10739,23 +9111,13 @@
           <w14:ligatures w14:val="none"/>
         </w:rPr>
       </w:pPr>
-      <w:proofErr w:type="spellStart"/>
-      <w:r>
-        <w:rPr>
-          <w:rFonts w:ascii="Times New Roman" w:eastAsia="Times New Roman" w:hAnsi="Times New Roman" w:cs="Times New Roman"/>
-          <w:kern w:val="0"/>
-          <w14:ligatures w14:val="none"/>
-        </w:rPr>
-        <w:t>MLflow</w:t>
-      </w:r>
-      <w:proofErr w:type="spellEnd"/>
-      <w:r>
-        <w:rPr>
-          <w:rFonts w:ascii="Times New Roman" w:eastAsia="Times New Roman" w:hAnsi="Times New Roman" w:cs="Times New Roman"/>
-          <w:kern w:val="0"/>
-          <w14:ligatures w14:val="none"/>
-        </w:rPr>
-        <w:t xml:space="preserve"> for experiments</w:t>
+      <w:r>
+        <w:rPr>
+          <w:rFonts w:ascii="Times New Roman" w:eastAsia="Times New Roman" w:hAnsi="Times New Roman" w:cs="Times New Roman"/>
+          <w:kern w:val="0"/>
+          <w14:ligatures w14:val="none"/>
+        </w:rPr>
+        <w:t>MLflow for experiments</w:t>
       </w:r>
     </w:p>
     <w:p>
@@ -10794,18 +9156,9 @@
           <w:rFonts w:ascii="Times New Roman" w:eastAsia="Times New Roman" w:hAnsi="Times New Roman" w:cs="Times New Roman"/>
           <w:noProof/>
           <w:kern w:val="0"/>
-          <w14:ligatures w14:val="none"/>
-        </w:rPr>
-      </w:r>
-      <w:r>
-        <w:rPr>
-          <w:rFonts w:ascii="Times New Roman" w:eastAsia="Times New Roman" w:hAnsi="Times New Roman" w:cs="Times New Roman"/>
-          <w:noProof/>
-          <w:kern w:val="0"/>
-          <w14:ligatures w14:val="none"/>
-        </w:rPr>
-        <w:pict w14:anchorId="76BE816C">
-          <v:rect id="_x0000_i1043" alt="" style="width:468pt;height:.05pt;mso-width-percent:0;mso-height-percent:0;mso-width-percent:0;mso-height-percent:0" o:hralign="center" o:hrstd="t" o:hr="t" fillcolor="#a0a0a0" stroked="f"/>
+        </w:rPr>
+        <w:pict w14:anchorId="577023AC">
+          <v:rect id="_x0000_i1027" alt="" style="width:468pt;height:.05pt;mso-width-percent:0;mso-height-percent:0;mso-width-percent:0;mso-height-percent:0" o:hralign="center" o:hrstd="t" o:hr="t" fillcolor="#a0a0a0" stroked="f"/>
         </w:pict>
       </w:r>
     </w:p>
@@ -11086,18 +9439,9 @@
           <w:rFonts w:ascii="Times New Roman" w:eastAsia="Times New Roman" w:hAnsi="Times New Roman" w:cs="Times New Roman"/>
           <w:noProof/>
           <w:kern w:val="0"/>
-          <w14:ligatures w14:val="none"/>
-        </w:rPr>
-      </w:r>
-      <w:r>
-        <w:rPr>
-          <w:rFonts w:ascii="Times New Roman" w:eastAsia="Times New Roman" w:hAnsi="Times New Roman" w:cs="Times New Roman"/>
-          <w:noProof/>
-          <w:kern w:val="0"/>
-          <w14:ligatures w14:val="none"/>
-        </w:rPr>
-        <w:pict w14:anchorId="05781283">
-          <v:rect id="_x0000_i1044" alt="" style="width:468pt;height:.05pt;mso-width-percent:0;mso-height-percent:0;mso-width-percent:0;mso-height-percent:0" o:hralign="center" o:hrstd="t" o:hr="t" fillcolor="#a0a0a0" stroked="f"/>
+        </w:rPr>
+        <w:pict w14:anchorId="4DF0C539">
+          <v:rect id="_x0000_i1026" alt="" style="width:468pt;height:.05pt;mso-width-percent:0;mso-height-percent:0;mso-width-percent:0;mso-height-percent:0" o:hralign="center" o:hrstd="t" o:hr="t" fillcolor="#a0a0a0" stroked="f"/>
         </w:pict>
       </w:r>
     </w:p>
@@ -11292,18 +9636,9 @@
           <w:rFonts w:ascii="Times New Roman" w:eastAsia="Times New Roman" w:hAnsi="Times New Roman" w:cs="Times New Roman"/>
           <w:noProof/>
           <w:kern w:val="0"/>
-          <w14:ligatures w14:val="none"/>
-        </w:rPr>
-      </w:r>
-      <w:r>
-        <w:rPr>
-          <w:rFonts w:ascii="Times New Roman" w:eastAsia="Times New Roman" w:hAnsi="Times New Roman" w:cs="Times New Roman"/>
-          <w:noProof/>
-          <w:kern w:val="0"/>
-          <w14:ligatures w14:val="none"/>
-        </w:rPr>
-        <w:pict w14:anchorId="6A6ACBE2">
-          <v:rect id="_x0000_i1045" alt="" style="width:468pt;height:.05pt;mso-width-percent:0;mso-height-percent:0;mso-width-percent:0;mso-height-percent:0" o:hralign="center" o:hrstd="t" o:hr="t" fillcolor="#a0a0a0" stroked="f"/>
+        </w:rPr>
+        <w:pict w14:anchorId="68F36303">
+          <v:rect id="_x0000_i1025" alt="" style="width:468pt;height:.05pt;mso-width-percent:0;mso-height-percent:0;mso-width-percent:0;mso-height-percent:0" o:hralign="center" o:hrstd="t" o:hr="t" fillcolor="#a0a0a0" stroked="f"/>
         </w:pict>
       </w:r>
     </w:p>
@@ -11457,18 +9792,8 @@
           <w:kern w:val="0"/>
           <w14:ligatures w14:val="none"/>
         </w:rPr>
-        <w:t xml:space="preserve">Backend: </w:t>
-      </w:r>
-      <w:proofErr w:type="spellStart"/>
-      <w:r>
-        <w:rPr>
-          <w:rFonts w:ascii="Times New Roman" w:eastAsia="Times New Roman" w:hAnsi="Times New Roman" w:cs="Times New Roman"/>
-          <w:kern w:val="0"/>
-          <w14:ligatures w14:val="none"/>
-        </w:rPr>
-        <w:t>FastAPI</w:t>
-      </w:r>
-      <w:proofErr w:type="spellEnd"/>
+        <w:t>Backend: FastAPI</w:t>
+      </w:r>
     </w:p>
     <w:p>
       <w:pPr>
@@ -11489,18 +9814,8 @@
           <w:kern w:val="0"/>
           <w14:ligatures w14:val="none"/>
         </w:rPr>
-        <w:t xml:space="preserve">UI: </w:t>
-      </w:r>
-      <w:proofErr w:type="spellStart"/>
-      <w:r>
-        <w:rPr>
-          <w:rFonts w:ascii="Times New Roman" w:eastAsia="Times New Roman" w:hAnsi="Times New Roman" w:cs="Times New Roman"/>
-          <w:kern w:val="0"/>
-          <w14:ligatures w14:val="none"/>
-        </w:rPr>
-        <w:t>Streamlit</w:t>
-      </w:r>
-      <w:proofErr w:type="spellEnd"/>
+        <w:t>UI: Streamlit</w:t>
+      </w:r>
     </w:p>
     <w:p>
       <w:pPr>
@@ -11521,43 +9836,7 @@
           <w:kern w:val="0"/>
           <w14:ligatures w14:val="none"/>
         </w:rPr>
-        <w:t xml:space="preserve">Orchestration: </w:t>
-      </w:r>
-      <w:proofErr w:type="spellStart"/>
-      <w:r>
-        <w:rPr>
-          <w:rFonts w:ascii="Times New Roman" w:eastAsia="Times New Roman" w:hAnsi="Times New Roman" w:cs="Times New Roman"/>
-          <w:kern w:val="0"/>
-          <w14:ligatures w14:val="none"/>
-        </w:rPr>
-        <w:t>CrewAI</w:t>
-      </w:r>
-      <w:proofErr w:type="spellEnd"/>
-      <w:r>
-        <w:rPr>
-          <w:rFonts w:ascii="Times New Roman" w:eastAsia="Times New Roman" w:hAnsi="Times New Roman" w:cs="Times New Roman"/>
-          <w:kern w:val="0"/>
-          <w14:ligatures w14:val="none"/>
-        </w:rPr>
-        <w:t xml:space="preserve"> or </w:t>
-      </w:r>
-      <w:proofErr w:type="spellStart"/>
-      <w:r>
-        <w:rPr>
-          <w:rFonts w:ascii="Times New Roman" w:eastAsia="Times New Roman" w:hAnsi="Times New Roman" w:cs="Times New Roman"/>
-          <w:kern w:val="0"/>
-          <w14:ligatures w14:val="none"/>
-        </w:rPr>
-        <w:t>LangGraph</w:t>
-      </w:r>
-      <w:proofErr w:type="spellEnd"/>
-      <w:r>
-        <w:rPr>
-          <w:rFonts w:ascii="Times New Roman" w:eastAsia="Times New Roman" w:hAnsi="Times New Roman" w:cs="Times New Roman"/>
-          <w:kern w:val="0"/>
-          <w14:ligatures w14:val="none"/>
-        </w:rPr>
-        <w:t xml:space="preserve"> (pick one)</w:t>
+        <w:t>Orchestration: CrewAI or LangGraph (pick one)</w:t>
       </w:r>
     </w:p>
     <w:p>

</xml_diff>